<commit_message>
CAR Varones: indice de planos ordenado de la DPLV-01 a la DPLV-44 (y relacion de planos de la memoria descriptiva)
Co-Authored-By: Claude Opus 5.5 <noreply@anthropic.com>
Claude-Session: https://claude.ai/code/session_0142t8T16igb3VKxUPwnQPq6
</commit_message>
<xml_diff>
--- a/entregables_varones/INDICE_DE_PLANOS_DRENAJE_PLUVIAL_CAR_VARONES.docx
+++ b/entregables_varones/INDICE_DE_PLANOS_DRENAJE_PLUVIAL_CAR_VARONES.docx
@@ -224,35 +224,6 @@
         </w:trPr>
         <w:tc>
           <w:tcPr>
-            <w:tcW w:type="dxa" w:w="9864"/>
-            <w:gridSpan w:val="5"/>
-            <w:shd w:val="clear" w:color="auto" w:fill="F2E6E8"/>
-            <w:vAlign w:val="center"/>
-          </w:tcPr>
-          <w:p>
-            <w:pPr>
-              <w:spacing w:before="20" w:after="20" w:line="240" w:lineRule="auto"/>
-              <w:jc w:val="left"/>
-            </w:pPr>
-            <w:r>
-              <w:rPr>
-                <w:rFonts w:ascii="Arial" w:hAnsi="Arial" w:eastAsia="Arial"/>
-                <w:b/>
-                <w:i w:val="0"/>
-                <w:color w:val="7B1E2B"/>
-                <w:sz w:val="15"/>
-              </w:rPr>
-              <w:t>LÁMINAS EN FORMATO A0  (4)</w:t>
-            </w:r>
-          </w:p>
-        </w:tc>
-      </w:tr>
-      <w:tr>
-        <w:trPr>
-          <w:cantSplit/>
-        </w:trPr>
-        <w:tc>
-          <w:tcPr>
             <w:tcW w:type="dxa" w:w="454"/>
             <w:vAlign w:val="center"/>
           </w:tcPr>
@@ -401,6 +372,387 @@
                 <w:color w:val="7B1E2B"/>
                 <w:sz w:val="16"/>
               </w:rPr>
+              <w:t>DPLV-02</w:t>
+            </w:r>
+          </w:p>
+        </w:tc>
+        <w:tc>
+          <w:tcPr>
+            <w:tcW w:type="dxa" w:w="6407"/>
+            <w:vAlign w:val="center"/>
+          </w:tcPr>
+          <w:p>
+            <w:pPr>
+              <w:spacing w:before="20" w:after="20" w:line="240" w:lineRule="auto"/>
+              <w:jc w:val="left"/>
+            </w:pPr>
+            <w:r>
+              <w:rPr>
+                <w:rFonts w:ascii="Arial" w:hAnsi="Arial" w:eastAsia="Arial"/>
+                <w:b/>
+                <w:i w:val="0"/>
+                <w:sz w:val="16"/>
+              </w:rPr>
+              <w:t>SECCIONES TRANSVERSALES 01</w:t>
+            </w:r>
+          </w:p>
+          <w:p>
+            <w:pPr>
+              <w:spacing w:before="0" w:after="20" w:line="240" w:lineRule="auto"/>
+              <w:jc w:val="left"/>
+            </w:pPr>
+            <w:r>
+              <w:rPr>
+                <w:rFonts w:ascii="Arial" w:hAnsi="Arial" w:eastAsia="Arial"/>
+                <w:b w:val="0"/>
+                <w:i w:val="0"/>
+                <w:color w:val="595959"/>
+                <w:sz w:val="13"/>
+              </w:rPr>
+              <w:t>SECCIONES 01 A 15</w:t>
+            </w:r>
+          </w:p>
+        </w:tc>
+        <w:tc>
+          <w:tcPr>
+            <w:tcW w:type="dxa" w:w="1020"/>
+            <w:vAlign w:val="center"/>
+          </w:tcPr>
+          <w:p>
+            <w:pPr>
+              <w:spacing w:before="20" w:after="20" w:line="240" w:lineRule="auto"/>
+              <w:jc w:val="center"/>
+            </w:pPr>
+            <w:r>
+              <w:rPr>
+                <w:rFonts w:ascii="Arial" w:hAnsi="Arial" w:eastAsia="Arial"/>
+                <w:b w:val="0"/>
+                <w:i w:val="0"/>
+                <w:sz w:val="16"/>
+              </w:rPr>
+              <w:t>A2</w:t>
+            </w:r>
+          </w:p>
+        </w:tc>
+        <w:tc>
+          <w:tcPr>
+            <w:tcW w:type="dxa" w:w="1077"/>
+            <w:vAlign w:val="center"/>
+          </w:tcPr>
+          <w:p>
+            <w:pPr>
+              <w:spacing w:before="20" w:after="20" w:line="240" w:lineRule="auto"/>
+              <w:jc w:val="center"/>
+            </w:pPr>
+            <w:r>
+              <w:rPr>
+                <w:rFonts w:ascii="Arial" w:hAnsi="Arial" w:eastAsia="Arial"/>
+                <w:b w:val="0"/>
+                <w:i w:val="0"/>
+                <w:sz w:val="16"/>
+              </w:rPr>
+              <w:t>INDICADA</w:t>
+            </w:r>
+          </w:p>
+        </w:tc>
+      </w:tr>
+      <w:tr>
+        <w:trPr>
+          <w:cantSplit/>
+        </w:trPr>
+        <w:tc>
+          <w:tcPr>
+            <w:tcW w:type="dxa" w:w="454"/>
+            <w:vAlign w:val="center"/>
+          </w:tcPr>
+          <w:p>
+            <w:pPr>
+              <w:spacing w:before="20" w:after="20" w:line="240" w:lineRule="auto"/>
+              <w:jc w:val="center"/>
+            </w:pPr>
+            <w:r>
+              <w:rPr>
+                <w:rFonts w:ascii="Arial" w:hAnsi="Arial" w:eastAsia="Arial"/>
+                <w:b w:val="0"/>
+                <w:i w:val="0"/>
+                <w:sz w:val="16"/>
+              </w:rPr>
+              <w:t>03</w:t>
+            </w:r>
+          </w:p>
+        </w:tc>
+        <w:tc>
+          <w:tcPr>
+            <w:tcW w:type="dxa" w:w="907"/>
+            <w:vAlign w:val="center"/>
+          </w:tcPr>
+          <w:p>
+            <w:pPr>
+              <w:spacing w:before="20" w:after="20" w:line="240" w:lineRule="auto"/>
+              <w:jc w:val="center"/>
+            </w:pPr>
+            <w:r>
+              <w:rPr>
+                <w:rFonts w:ascii="Arial" w:hAnsi="Arial" w:eastAsia="Arial"/>
+                <w:b/>
+                <w:i w:val="0"/>
+                <w:color w:val="7B1E2B"/>
+                <w:sz w:val="16"/>
+              </w:rPr>
+              <w:t>DPLV-03</w:t>
+            </w:r>
+          </w:p>
+        </w:tc>
+        <w:tc>
+          <w:tcPr>
+            <w:tcW w:type="dxa" w:w="6407"/>
+            <w:vAlign w:val="center"/>
+          </w:tcPr>
+          <w:p>
+            <w:pPr>
+              <w:spacing w:before="20" w:after="20" w:line="240" w:lineRule="auto"/>
+              <w:jc w:val="left"/>
+            </w:pPr>
+            <w:r>
+              <w:rPr>
+                <w:rFonts w:ascii="Arial" w:hAnsi="Arial" w:eastAsia="Arial"/>
+                <w:b/>
+                <w:i w:val="0"/>
+                <w:sz w:val="16"/>
+              </w:rPr>
+              <w:t>SECCIONES TRANSVERSALES 02</w:t>
+            </w:r>
+          </w:p>
+          <w:p>
+            <w:pPr>
+              <w:spacing w:before="0" w:after="20" w:line="240" w:lineRule="auto"/>
+              <w:jc w:val="left"/>
+            </w:pPr>
+            <w:r>
+              <w:rPr>
+                <w:rFonts w:ascii="Arial" w:hAnsi="Arial" w:eastAsia="Arial"/>
+                <w:b w:val="0"/>
+                <w:i w:val="0"/>
+                <w:color w:val="595959"/>
+                <w:sz w:val="13"/>
+              </w:rPr>
+              <w:t>SECCIONES 16 A 30</w:t>
+            </w:r>
+          </w:p>
+        </w:tc>
+        <w:tc>
+          <w:tcPr>
+            <w:tcW w:type="dxa" w:w="1020"/>
+            <w:vAlign w:val="center"/>
+          </w:tcPr>
+          <w:p>
+            <w:pPr>
+              <w:spacing w:before="20" w:after="20" w:line="240" w:lineRule="auto"/>
+              <w:jc w:val="center"/>
+            </w:pPr>
+            <w:r>
+              <w:rPr>
+                <w:rFonts w:ascii="Arial" w:hAnsi="Arial" w:eastAsia="Arial"/>
+                <w:b w:val="0"/>
+                <w:i w:val="0"/>
+                <w:sz w:val="16"/>
+              </w:rPr>
+              <w:t>A2</w:t>
+            </w:r>
+          </w:p>
+        </w:tc>
+        <w:tc>
+          <w:tcPr>
+            <w:tcW w:type="dxa" w:w="1077"/>
+            <w:vAlign w:val="center"/>
+          </w:tcPr>
+          <w:p>
+            <w:pPr>
+              <w:spacing w:before="20" w:after="20" w:line="240" w:lineRule="auto"/>
+              <w:jc w:val="center"/>
+            </w:pPr>
+            <w:r>
+              <w:rPr>
+                <w:rFonts w:ascii="Arial" w:hAnsi="Arial" w:eastAsia="Arial"/>
+                <w:b w:val="0"/>
+                <w:i w:val="0"/>
+                <w:sz w:val="16"/>
+              </w:rPr>
+              <w:t>INDICADA</w:t>
+            </w:r>
+          </w:p>
+        </w:tc>
+      </w:tr>
+      <w:tr>
+        <w:trPr>
+          <w:cantSplit/>
+        </w:trPr>
+        <w:tc>
+          <w:tcPr>
+            <w:tcW w:type="dxa" w:w="454"/>
+            <w:vAlign w:val="center"/>
+          </w:tcPr>
+          <w:p>
+            <w:pPr>
+              <w:spacing w:before="20" w:after="20" w:line="240" w:lineRule="auto"/>
+              <w:jc w:val="center"/>
+            </w:pPr>
+            <w:r>
+              <w:rPr>
+                <w:rFonts w:ascii="Arial" w:hAnsi="Arial" w:eastAsia="Arial"/>
+                <w:b w:val="0"/>
+                <w:i w:val="0"/>
+                <w:sz w:val="16"/>
+              </w:rPr>
+              <w:t>04</w:t>
+            </w:r>
+          </w:p>
+        </w:tc>
+        <w:tc>
+          <w:tcPr>
+            <w:tcW w:type="dxa" w:w="907"/>
+            <w:vAlign w:val="center"/>
+          </w:tcPr>
+          <w:p>
+            <w:pPr>
+              <w:spacing w:before="20" w:after="20" w:line="240" w:lineRule="auto"/>
+              <w:jc w:val="center"/>
+            </w:pPr>
+            <w:r>
+              <w:rPr>
+                <w:rFonts w:ascii="Arial" w:hAnsi="Arial" w:eastAsia="Arial"/>
+                <w:b/>
+                <w:i w:val="0"/>
+                <w:color w:val="7B1E2B"/>
+                <w:sz w:val="16"/>
+              </w:rPr>
+              <w:t>DPLV-04</w:t>
+            </w:r>
+          </w:p>
+        </w:tc>
+        <w:tc>
+          <w:tcPr>
+            <w:tcW w:type="dxa" w:w="6407"/>
+            <w:vAlign w:val="center"/>
+          </w:tcPr>
+          <w:p>
+            <w:pPr>
+              <w:spacing w:before="20" w:after="20" w:line="240" w:lineRule="auto"/>
+              <w:jc w:val="left"/>
+            </w:pPr>
+            <w:r>
+              <w:rPr>
+                <w:rFonts w:ascii="Arial" w:hAnsi="Arial" w:eastAsia="Arial"/>
+                <w:b/>
+                <w:i w:val="0"/>
+                <w:sz w:val="16"/>
+              </w:rPr>
+              <w:t>SECCIONES TRANSVERSALES 03</w:t>
+            </w:r>
+          </w:p>
+          <w:p>
+            <w:pPr>
+              <w:spacing w:before="0" w:after="20" w:line="240" w:lineRule="auto"/>
+              <w:jc w:val="left"/>
+            </w:pPr>
+            <w:r>
+              <w:rPr>
+                <w:rFonts w:ascii="Arial" w:hAnsi="Arial" w:eastAsia="Arial"/>
+                <w:b w:val="0"/>
+                <w:i w:val="0"/>
+                <w:color w:val="595959"/>
+                <w:sz w:val="13"/>
+              </w:rPr>
+              <w:t>SECCIONES 31 A 43</w:t>
+            </w:r>
+          </w:p>
+        </w:tc>
+        <w:tc>
+          <w:tcPr>
+            <w:tcW w:type="dxa" w:w="1020"/>
+            <w:vAlign w:val="center"/>
+          </w:tcPr>
+          <w:p>
+            <w:pPr>
+              <w:spacing w:before="20" w:after="20" w:line="240" w:lineRule="auto"/>
+              <w:jc w:val="center"/>
+            </w:pPr>
+            <w:r>
+              <w:rPr>
+                <w:rFonts w:ascii="Arial" w:hAnsi="Arial" w:eastAsia="Arial"/>
+                <w:b w:val="0"/>
+                <w:i w:val="0"/>
+                <w:sz w:val="16"/>
+              </w:rPr>
+              <w:t>A2</w:t>
+            </w:r>
+          </w:p>
+        </w:tc>
+        <w:tc>
+          <w:tcPr>
+            <w:tcW w:type="dxa" w:w="1077"/>
+            <w:vAlign w:val="center"/>
+          </w:tcPr>
+          <w:p>
+            <w:pPr>
+              <w:spacing w:before="20" w:after="20" w:line="240" w:lineRule="auto"/>
+              <w:jc w:val="center"/>
+            </w:pPr>
+            <w:r>
+              <w:rPr>
+                <w:rFonts w:ascii="Arial" w:hAnsi="Arial" w:eastAsia="Arial"/>
+                <w:b w:val="0"/>
+                <w:i w:val="0"/>
+                <w:sz w:val="16"/>
+              </w:rPr>
+              <w:t>INDICADA</w:t>
+            </w:r>
+          </w:p>
+        </w:tc>
+      </w:tr>
+      <w:tr>
+        <w:trPr>
+          <w:cantSplit/>
+        </w:trPr>
+        <w:tc>
+          <w:tcPr>
+            <w:tcW w:type="dxa" w:w="454"/>
+            <w:vAlign w:val="center"/>
+          </w:tcPr>
+          <w:p>
+            <w:pPr>
+              <w:spacing w:before="20" w:after="20" w:line="240" w:lineRule="auto"/>
+              <w:jc w:val="center"/>
+            </w:pPr>
+            <w:r>
+              <w:rPr>
+                <w:rFonts w:ascii="Arial" w:hAnsi="Arial" w:eastAsia="Arial"/>
+                <w:b w:val="0"/>
+                <w:i w:val="0"/>
+                <w:sz w:val="16"/>
+              </w:rPr>
+              <w:t>05</w:t>
+            </w:r>
+          </w:p>
+        </w:tc>
+        <w:tc>
+          <w:tcPr>
+            <w:tcW w:type="dxa" w:w="907"/>
+            <w:vAlign w:val="center"/>
+          </w:tcPr>
+          <w:p>
+            <w:pPr>
+              <w:spacing w:before="20" w:after="20" w:line="240" w:lineRule="auto"/>
+              <w:jc w:val="center"/>
+            </w:pPr>
+            <w:r>
+              <w:rPr>
+                <w:rFonts w:ascii="Arial" w:hAnsi="Arial" w:eastAsia="Arial"/>
+                <w:b/>
+                <w:i w:val="0"/>
+                <w:color w:val="7B1E2B"/>
+                <w:sz w:val="16"/>
+              </w:rPr>
               <w:t>DPLV-05</w:t>
             </w:r>
           </w:p>
@@ -506,7 +858,7 @@
                 <w:i w:val="0"/>
                 <w:sz w:val="16"/>
               </w:rPr>
-              <w:t>03</w:t>
+              <w:t>06</w:t>
             </w:r>
           </w:p>
         </w:tc>
@@ -528,7 +880,7 @@
                 <w:color w:val="7B1E2B"/>
                 <w:sz w:val="16"/>
               </w:rPr>
-              <w:t>DPLV-17</w:t>
+              <w:t>DPLV-06</w:t>
             </w:r>
           </w:p>
         </w:tc>
@@ -549,7 +901,23 @@
                 <w:i w:val="0"/>
                 <w:sz w:val="16"/>
               </w:rPr>
-              <w:t>PLANTA DEL COLECTOR PLUVIAL</w:t>
+              <w:t>PERFILES LONGITUDINALES 02</w:t>
+            </w:r>
+          </w:p>
+          <w:p>
+            <w:pPr>
+              <w:spacing w:before="0" w:after="20" w:line="240" w:lineRule="auto"/>
+              <w:jc w:val="left"/>
+            </w:pPr>
+            <w:r>
+              <w:rPr>
+                <w:rFonts w:ascii="Arial" w:hAnsi="Arial" w:eastAsia="Arial"/>
+                <w:b w:val="0"/>
+                <w:i w:val="0"/>
+                <w:color w:val="595959"/>
+                <w:sz w:val="13"/>
+              </w:rPr>
+              <w:t>EJES 07 A 09, CON LAS SECCIONES 31 A 42</w:t>
             </w:r>
           </w:p>
         </w:tc>
@@ -570,7 +938,7 @@
                 <w:i w:val="0"/>
                 <w:sz w:val="16"/>
               </w:rPr>
-              <w:t>A0</w:t>
+              <w:t>A2</w:t>
             </w:r>
           </w:p>
         </w:tc>
@@ -617,147 +985,7 @@
                 <w:i w:val="0"/>
                 <w:sz w:val="16"/>
               </w:rPr>
-              <w:t>04</w:t>
-            </w:r>
-          </w:p>
-        </w:tc>
-        <w:tc>
-          <w:tcPr>
-            <w:tcW w:type="dxa" w:w="907"/>
-            <w:vAlign w:val="center"/>
-          </w:tcPr>
-          <w:p>
-            <w:pPr>
-              <w:spacing w:before="20" w:after="20" w:line="240" w:lineRule="auto"/>
-              <w:jc w:val="center"/>
-            </w:pPr>
-            <w:r>
-              <w:rPr>
-                <w:rFonts w:ascii="Arial" w:hAnsi="Arial" w:eastAsia="Arial"/>
-                <w:b/>
-                <w:i w:val="0"/>
-                <w:color w:val="7B1E2B"/>
-                <w:sz w:val="16"/>
-              </w:rPr>
-              <w:t>DPLV-43</w:t>
-            </w:r>
-          </w:p>
-        </w:tc>
-        <w:tc>
-          <w:tcPr>
-            <w:tcW w:type="dxa" w:w="6407"/>
-            <w:vAlign w:val="center"/>
-          </w:tcPr>
-          <w:p>
-            <w:pPr>
-              <w:spacing w:before="20" w:after="20" w:line="240" w:lineRule="auto"/>
-              <w:jc w:val="left"/>
-            </w:pPr>
-            <w:r>
-              <w:rPr>
-                <w:rFonts w:ascii="Arial" w:hAnsi="Arial" w:eastAsia="Arial"/>
-                <w:b/>
-                <w:i w:val="0"/>
-                <w:sz w:val="16"/>
-              </w:rPr>
-              <w:t>PLANTA DE UBICACIÓN DE LLORADEROS EN CUNETAS COLINDANTES CON ÁREA VERDE</w:t>
-            </w:r>
-          </w:p>
-        </w:tc>
-        <w:tc>
-          <w:tcPr>
-            <w:tcW w:type="dxa" w:w="1020"/>
-            <w:vAlign w:val="center"/>
-          </w:tcPr>
-          <w:p>
-            <w:pPr>
-              <w:spacing w:before="20" w:after="20" w:line="240" w:lineRule="auto"/>
-              <w:jc w:val="center"/>
-            </w:pPr>
-            <w:r>
-              <w:rPr>
-                <w:rFonts w:ascii="Arial" w:hAnsi="Arial" w:eastAsia="Arial"/>
-                <w:b w:val="0"/>
-                <w:i w:val="0"/>
-                <w:sz w:val="16"/>
-              </w:rPr>
-              <w:t>A0</w:t>
-            </w:r>
-          </w:p>
-        </w:tc>
-        <w:tc>
-          <w:tcPr>
-            <w:tcW w:type="dxa" w:w="1077"/>
-            <w:vAlign w:val="center"/>
-          </w:tcPr>
-          <w:p>
-            <w:pPr>
-              <w:spacing w:before="20" w:after="20" w:line="240" w:lineRule="auto"/>
-              <w:jc w:val="center"/>
-            </w:pPr>
-            <w:r>
-              <w:rPr>
-                <w:rFonts w:ascii="Arial" w:hAnsi="Arial" w:eastAsia="Arial"/>
-                <w:b w:val="0"/>
-                <w:i w:val="0"/>
-                <w:sz w:val="16"/>
-              </w:rPr>
-              <w:t>INDICADA</w:t>
-            </w:r>
-          </w:p>
-        </w:tc>
-      </w:tr>
-      <w:tr>
-        <w:trPr>
-          <w:cantSplit/>
-        </w:trPr>
-        <w:tc>
-          <w:tcPr>
-            <w:tcW w:type="dxa" w:w="9864"/>
-            <w:gridSpan w:val="5"/>
-            <w:shd w:val="clear" w:color="auto" w:fill="F2E6E8"/>
-            <w:vAlign w:val="center"/>
-          </w:tcPr>
-          <w:p>
-            <w:pPr>
-              <w:spacing w:before="20" w:after="20" w:line="240" w:lineRule="auto"/>
-              <w:jc w:val="left"/>
-            </w:pPr>
-            <w:r>
-              <w:rPr>
-                <w:rFonts w:ascii="Arial" w:hAnsi="Arial" w:eastAsia="Arial"/>
-                <w:b/>
-                <w:i w:val="0"/>
-                <w:color w:val="7B1E2B"/>
-                <w:sz w:val="15"/>
-              </w:rPr>
-              <w:t>LÁMINAS EN FORMATO A1  (13)</w:t>
-            </w:r>
-          </w:p>
-        </w:tc>
-      </w:tr>
-      <w:tr>
-        <w:trPr>
-          <w:cantSplit/>
-        </w:trPr>
-        <w:tc>
-          <w:tcPr>
-            <w:tcW w:type="dxa" w:w="454"/>
-            <w:vAlign w:val="center"/>
-          </w:tcPr>
-          <w:p>
-            <w:pPr>
-              <w:spacing w:before="20" w:after="20" w:line="240" w:lineRule="auto"/>
-              <w:jc w:val="center"/>
-            </w:pPr>
-            <w:r>
-              <w:rPr>
-                <w:rFonts w:ascii="Arial" w:hAnsi="Arial" w:eastAsia="Arial"/>
-                <w:b w:val="0"/>
-                <w:i w:val="0"/>
-                <w:sz w:val="16"/>
-              </w:rPr>
-              <w:t>05</w:t>
+              <w:t>07</w:t>
             </w:r>
           </w:p>
         </w:tc>
@@ -884,7 +1112,7 @@
                 <w:i w:val="0"/>
                 <w:sz w:val="16"/>
               </w:rPr>
-              <w:t>06</w:t>
+              <w:t>08</w:t>
             </w:r>
           </w:p>
         </w:tc>
@@ -1027,7 +1255,7 @@
                 <w:i w:val="0"/>
                 <w:sz w:val="16"/>
               </w:rPr>
-              <w:t>07</w:t>
+              <w:t>09</w:t>
             </w:r>
           </w:p>
         </w:tc>
@@ -1170,7 +1398,7 @@
                 <w:i w:val="0"/>
                 <w:sz w:val="16"/>
               </w:rPr>
-              <w:t>08</w:t>
+              <w:t>10</w:t>
             </w:r>
           </w:p>
         </w:tc>
@@ -1313,7 +1541,7 @@
                 <w:i w:val="0"/>
                 <w:sz w:val="16"/>
               </w:rPr>
-              <w:t>09</w:t>
+              <w:t>11</w:t>
             </w:r>
           </w:p>
         </w:tc>
@@ -1456,7 +1684,7 @@
                 <w:i w:val="0"/>
                 <w:sz w:val="16"/>
               </w:rPr>
-              <w:t>10</w:t>
+              <w:t>12</w:t>
             </w:r>
           </w:p>
         </w:tc>
@@ -1599,7 +1827,7 @@
                 <w:i w:val="0"/>
                 <w:sz w:val="16"/>
               </w:rPr>
-              <w:t>11</w:t>
+              <w:t>13</w:t>
             </w:r>
           </w:p>
         </w:tc>
@@ -1742,7 +1970,7 @@
                 <w:i w:val="0"/>
                 <w:sz w:val="16"/>
               </w:rPr>
-              <w:t>12</w:t>
+              <w:t>14</w:t>
             </w:r>
           </w:p>
         </w:tc>
@@ -1885,7 +2113,7 @@
                 <w:i w:val="0"/>
                 <w:sz w:val="16"/>
               </w:rPr>
-              <w:t>13</w:t>
+              <w:t>15</w:t>
             </w:r>
           </w:p>
         </w:tc>
@@ -2028,7 +2256,7 @@
                 <w:i w:val="0"/>
                 <w:sz w:val="16"/>
               </w:rPr>
-              <w:t>14</w:t>
+              <w:t>16</w:t>
             </w:r>
           </w:p>
         </w:tc>
@@ -2171,7 +2399,118 @@
                 <w:i w:val="0"/>
                 <w:sz w:val="16"/>
               </w:rPr>
-              <w:t>15</w:t>
+              <w:t>17</w:t>
+            </w:r>
+          </w:p>
+        </w:tc>
+        <w:tc>
+          <w:tcPr>
+            <w:tcW w:type="dxa" w:w="907"/>
+            <w:vAlign w:val="center"/>
+          </w:tcPr>
+          <w:p>
+            <w:pPr>
+              <w:spacing w:before="20" w:after="20" w:line="240" w:lineRule="auto"/>
+              <w:jc w:val="center"/>
+            </w:pPr>
+            <w:r>
+              <w:rPr>
+                <w:rFonts w:ascii="Arial" w:hAnsi="Arial" w:eastAsia="Arial"/>
+                <w:b/>
+                <w:i w:val="0"/>
+                <w:color w:val="7B1E2B"/>
+                <w:sz w:val="16"/>
+              </w:rPr>
+              <w:t>DPLV-17</w:t>
+            </w:r>
+          </w:p>
+        </w:tc>
+        <w:tc>
+          <w:tcPr>
+            <w:tcW w:type="dxa" w:w="6407"/>
+            <w:vAlign w:val="center"/>
+          </w:tcPr>
+          <w:p>
+            <w:pPr>
+              <w:spacing w:before="20" w:after="20" w:line="240" w:lineRule="auto"/>
+              <w:jc w:val="left"/>
+            </w:pPr>
+            <w:r>
+              <w:rPr>
+                <w:rFonts w:ascii="Arial" w:hAnsi="Arial" w:eastAsia="Arial"/>
+                <w:b/>
+                <w:i w:val="0"/>
+                <w:sz w:val="16"/>
+              </w:rPr>
+              <w:t>PLANTA DEL COLECTOR PLUVIAL</w:t>
+            </w:r>
+          </w:p>
+        </w:tc>
+        <w:tc>
+          <w:tcPr>
+            <w:tcW w:type="dxa" w:w="1020"/>
+            <w:vAlign w:val="center"/>
+          </w:tcPr>
+          <w:p>
+            <w:pPr>
+              <w:spacing w:before="20" w:after="20" w:line="240" w:lineRule="auto"/>
+              <w:jc w:val="center"/>
+            </w:pPr>
+            <w:r>
+              <w:rPr>
+                <w:rFonts w:ascii="Arial" w:hAnsi="Arial" w:eastAsia="Arial"/>
+                <w:b w:val="0"/>
+                <w:i w:val="0"/>
+                <w:sz w:val="16"/>
+              </w:rPr>
+              <w:t>A0</w:t>
+            </w:r>
+          </w:p>
+        </w:tc>
+        <w:tc>
+          <w:tcPr>
+            <w:tcW w:type="dxa" w:w="1077"/>
+            <w:vAlign w:val="center"/>
+          </w:tcPr>
+          <w:p>
+            <w:pPr>
+              <w:spacing w:before="20" w:after="20" w:line="240" w:lineRule="auto"/>
+              <w:jc w:val="center"/>
+            </w:pPr>
+            <w:r>
+              <w:rPr>
+                <w:rFonts w:ascii="Arial" w:hAnsi="Arial" w:eastAsia="Arial"/>
+                <w:b w:val="0"/>
+                <w:i w:val="0"/>
+                <w:sz w:val="16"/>
+              </w:rPr>
+              <w:t>INDICADA</w:t>
+            </w:r>
+          </w:p>
+        </w:tc>
+      </w:tr>
+      <w:tr>
+        <w:trPr>
+          <w:cantSplit/>
+        </w:trPr>
+        <w:tc>
+          <w:tcPr>
+            <w:tcW w:type="dxa" w:w="454"/>
+            <w:vAlign w:val="center"/>
+          </w:tcPr>
+          <w:p>
+            <w:pPr>
+              <w:spacing w:before="20" w:after="20" w:line="240" w:lineRule="auto"/>
+              <w:jc w:val="center"/>
+            </w:pPr>
+            <w:r>
+              <w:rPr>
+                <w:rFonts w:ascii="Arial" w:hAnsi="Arial" w:eastAsia="Arial"/>
+                <w:b w:val="0"/>
+                <w:i w:val="0"/>
+                <w:sz w:val="16"/>
+              </w:rPr>
+              <w:t>18</w:t>
             </w:r>
           </w:p>
         </w:tc>
@@ -2298,7 +2637,515 @@
                 <w:i w:val="0"/>
                 <w:sz w:val="16"/>
               </w:rPr>
-              <w:t>16</w:t>
+              <w:t>19</w:t>
+            </w:r>
+          </w:p>
+        </w:tc>
+        <w:tc>
+          <w:tcPr>
+            <w:tcW w:type="dxa" w:w="907"/>
+            <w:vAlign w:val="center"/>
+          </w:tcPr>
+          <w:p>
+            <w:pPr>
+              <w:spacing w:before="20" w:after="20" w:line="240" w:lineRule="auto"/>
+              <w:jc w:val="center"/>
+            </w:pPr>
+            <w:r>
+              <w:rPr>
+                <w:rFonts w:ascii="Arial" w:hAnsi="Arial" w:eastAsia="Arial"/>
+                <w:b/>
+                <w:i w:val="0"/>
+                <w:color w:val="7B1E2B"/>
+                <w:sz w:val="16"/>
+              </w:rPr>
+              <w:t>DPLV-19</w:t>
+            </w:r>
+          </w:p>
+        </w:tc>
+        <w:tc>
+          <w:tcPr>
+            <w:tcW w:type="dxa" w:w="6407"/>
+            <w:vAlign w:val="center"/>
+          </w:tcPr>
+          <w:p>
+            <w:pPr>
+              <w:spacing w:before="20" w:after="20" w:line="240" w:lineRule="auto"/>
+              <w:jc w:val="left"/>
+            </w:pPr>
+            <w:r>
+              <w:rPr>
+                <w:rFonts w:ascii="Arial" w:hAnsi="Arial" w:eastAsia="Arial"/>
+                <w:b/>
+                <w:i w:val="0"/>
+                <w:sz w:val="16"/>
+              </w:rPr>
+              <w:t>PERFIL LONGITUDINAL DETALLADO DEL COLECTOR</w:t>
+            </w:r>
+          </w:p>
+          <w:p>
+            <w:pPr>
+              <w:spacing w:before="0" w:after="20" w:line="240" w:lineRule="auto"/>
+              <w:jc w:val="left"/>
+            </w:pPr>
+            <w:r>
+              <w:rPr>
+                <w:rFonts w:ascii="Arial" w:hAnsi="Arial" w:eastAsia="Arial"/>
+                <w:b w:val="0"/>
+                <w:i w:val="0"/>
+                <w:color w:val="595959"/>
+                <w:sz w:val="13"/>
+              </w:rPr>
+              <w:t>TRAMOS 1 A 3: PROG. 0+000.00 A 0+053.70</w:t>
+            </w:r>
+          </w:p>
+        </w:tc>
+        <w:tc>
+          <w:tcPr>
+            <w:tcW w:type="dxa" w:w="1020"/>
+            <w:vAlign w:val="center"/>
+          </w:tcPr>
+          <w:p>
+            <w:pPr>
+              <w:spacing w:before="20" w:after="20" w:line="240" w:lineRule="auto"/>
+              <w:jc w:val="center"/>
+            </w:pPr>
+            <w:r>
+              <w:rPr>
+                <w:rFonts w:ascii="Arial" w:hAnsi="Arial" w:eastAsia="Arial"/>
+                <w:b w:val="0"/>
+                <w:i w:val="0"/>
+                <w:sz w:val="16"/>
+              </w:rPr>
+              <w:t>A2</w:t>
+            </w:r>
+          </w:p>
+        </w:tc>
+        <w:tc>
+          <w:tcPr>
+            <w:tcW w:type="dxa" w:w="1077"/>
+            <w:vAlign w:val="center"/>
+          </w:tcPr>
+          <w:p>
+            <w:pPr>
+              <w:spacing w:before="20" w:after="20" w:line="240" w:lineRule="auto"/>
+              <w:jc w:val="center"/>
+            </w:pPr>
+            <w:r>
+              <w:rPr>
+                <w:rFonts w:ascii="Arial" w:hAnsi="Arial" w:eastAsia="Arial"/>
+                <w:b w:val="0"/>
+                <w:i w:val="0"/>
+                <w:sz w:val="16"/>
+              </w:rPr>
+              <w:t>INDICADA</w:t>
+            </w:r>
+          </w:p>
+        </w:tc>
+      </w:tr>
+      <w:tr>
+        <w:trPr>
+          <w:cantSplit/>
+        </w:trPr>
+        <w:tc>
+          <w:tcPr>
+            <w:tcW w:type="dxa" w:w="454"/>
+            <w:vAlign w:val="center"/>
+          </w:tcPr>
+          <w:p>
+            <w:pPr>
+              <w:spacing w:before="20" w:after="20" w:line="240" w:lineRule="auto"/>
+              <w:jc w:val="center"/>
+            </w:pPr>
+            <w:r>
+              <w:rPr>
+                <w:rFonts w:ascii="Arial" w:hAnsi="Arial" w:eastAsia="Arial"/>
+                <w:b w:val="0"/>
+                <w:i w:val="0"/>
+                <w:sz w:val="16"/>
+              </w:rPr>
+              <w:t>20</w:t>
+            </w:r>
+          </w:p>
+        </w:tc>
+        <w:tc>
+          <w:tcPr>
+            <w:tcW w:type="dxa" w:w="907"/>
+            <w:vAlign w:val="center"/>
+          </w:tcPr>
+          <w:p>
+            <w:pPr>
+              <w:spacing w:before="20" w:after="20" w:line="240" w:lineRule="auto"/>
+              <w:jc w:val="center"/>
+            </w:pPr>
+            <w:r>
+              <w:rPr>
+                <w:rFonts w:ascii="Arial" w:hAnsi="Arial" w:eastAsia="Arial"/>
+                <w:b/>
+                <w:i w:val="0"/>
+                <w:color w:val="7B1E2B"/>
+                <w:sz w:val="16"/>
+              </w:rPr>
+              <w:t>DPLV-20</w:t>
+            </w:r>
+          </w:p>
+        </w:tc>
+        <w:tc>
+          <w:tcPr>
+            <w:tcW w:type="dxa" w:w="6407"/>
+            <w:vAlign w:val="center"/>
+          </w:tcPr>
+          <w:p>
+            <w:pPr>
+              <w:spacing w:before="20" w:after="20" w:line="240" w:lineRule="auto"/>
+              <w:jc w:val="left"/>
+            </w:pPr>
+            <w:r>
+              <w:rPr>
+                <w:rFonts w:ascii="Arial" w:hAnsi="Arial" w:eastAsia="Arial"/>
+                <w:b/>
+                <w:i w:val="0"/>
+                <w:sz w:val="16"/>
+              </w:rPr>
+              <w:t>PERFIL LONGITUDINAL DETALLADO DEL COLECTOR</w:t>
+            </w:r>
+          </w:p>
+          <w:p>
+            <w:pPr>
+              <w:spacing w:before="0" w:after="20" w:line="240" w:lineRule="auto"/>
+              <w:jc w:val="left"/>
+            </w:pPr>
+            <w:r>
+              <w:rPr>
+                <w:rFonts w:ascii="Arial" w:hAnsi="Arial" w:eastAsia="Arial"/>
+                <w:b w:val="0"/>
+                <w:i w:val="0"/>
+                <w:color w:val="595959"/>
+                <w:sz w:val="13"/>
+              </w:rPr>
+              <w:t>TRAMOS 4 A 6: PROG. 0+053.70 A 0+105.29</w:t>
+            </w:r>
+          </w:p>
+        </w:tc>
+        <w:tc>
+          <w:tcPr>
+            <w:tcW w:type="dxa" w:w="1020"/>
+            <w:vAlign w:val="center"/>
+          </w:tcPr>
+          <w:p>
+            <w:pPr>
+              <w:spacing w:before="20" w:after="20" w:line="240" w:lineRule="auto"/>
+              <w:jc w:val="center"/>
+            </w:pPr>
+            <w:r>
+              <w:rPr>
+                <w:rFonts w:ascii="Arial" w:hAnsi="Arial" w:eastAsia="Arial"/>
+                <w:b w:val="0"/>
+                <w:i w:val="0"/>
+                <w:sz w:val="16"/>
+              </w:rPr>
+              <w:t>A2</w:t>
+            </w:r>
+          </w:p>
+        </w:tc>
+        <w:tc>
+          <w:tcPr>
+            <w:tcW w:type="dxa" w:w="1077"/>
+            <w:vAlign w:val="center"/>
+          </w:tcPr>
+          <w:p>
+            <w:pPr>
+              <w:spacing w:before="20" w:after="20" w:line="240" w:lineRule="auto"/>
+              <w:jc w:val="center"/>
+            </w:pPr>
+            <w:r>
+              <w:rPr>
+                <w:rFonts w:ascii="Arial" w:hAnsi="Arial" w:eastAsia="Arial"/>
+                <w:b w:val="0"/>
+                <w:i w:val="0"/>
+                <w:sz w:val="16"/>
+              </w:rPr>
+              <w:t>INDICADA</w:t>
+            </w:r>
+          </w:p>
+        </w:tc>
+      </w:tr>
+      <w:tr>
+        <w:trPr>
+          <w:cantSplit/>
+        </w:trPr>
+        <w:tc>
+          <w:tcPr>
+            <w:tcW w:type="dxa" w:w="454"/>
+            <w:vAlign w:val="center"/>
+          </w:tcPr>
+          <w:p>
+            <w:pPr>
+              <w:spacing w:before="20" w:after="20" w:line="240" w:lineRule="auto"/>
+              <w:jc w:val="center"/>
+            </w:pPr>
+            <w:r>
+              <w:rPr>
+                <w:rFonts w:ascii="Arial" w:hAnsi="Arial" w:eastAsia="Arial"/>
+                <w:b w:val="0"/>
+                <w:i w:val="0"/>
+                <w:sz w:val="16"/>
+              </w:rPr>
+              <w:t>21</w:t>
+            </w:r>
+          </w:p>
+        </w:tc>
+        <w:tc>
+          <w:tcPr>
+            <w:tcW w:type="dxa" w:w="907"/>
+            <w:vAlign w:val="center"/>
+          </w:tcPr>
+          <w:p>
+            <w:pPr>
+              <w:spacing w:before="20" w:after="20" w:line="240" w:lineRule="auto"/>
+              <w:jc w:val="center"/>
+            </w:pPr>
+            <w:r>
+              <w:rPr>
+                <w:rFonts w:ascii="Arial" w:hAnsi="Arial" w:eastAsia="Arial"/>
+                <w:b/>
+                <w:i w:val="0"/>
+                <w:color w:val="7B1E2B"/>
+                <w:sz w:val="16"/>
+              </w:rPr>
+              <w:t>DPLV-21</w:t>
+            </w:r>
+          </w:p>
+        </w:tc>
+        <w:tc>
+          <w:tcPr>
+            <w:tcW w:type="dxa" w:w="6407"/>
+            <w:vAlign w:val="center"/>
+          </w:tcPr>
+          <w:p>
+            <w:pPr>
+              <w:spacing w:before="20" w:after="20" w:line="240" w:lineRule="auto"/>
+              <w:jc w:val="left"/>
+            </w:pPr>
+            <w:r>
+              <w:rPr>
+                <w:rFonts w:ascii="Arial" w:hAnsi="Arial" w:eastAsia="Arial"/>
+                <w:b/>
+                <w:i w:val="0"/>
+                <w:sz w:val="16"/>
+              </w:rPr>
+              <w:t>SECCIONES TRANSVERSALES DEL COLECTOR</w:t>
+            </w:r>
+          </w:p>
+          <w:p>
+            <w:pPr>
+              <w:spacing w:before="0" w:after="20" w:line="240" w:lineRule="auto"/>
+              <w:jc w:val="left"/>
+            </w:pPr>
+            <w:r>
+              <w:rPr>
+                <w:rFonts w:ascii="Arial" w:hAnsi="Arial" w:eastAsia="Arial"/>
+                <w:b w:val="0"/>
+                <w:i w:val="0"/>
+                <w:color w:val="595959"/>
+                <w:sz w:val="13"/>
+              </w:rPr>
+              <w:t>SECCIONES S-01 A S-04</w:t>
+            </w:r>
+          </w:p>
+        </w:tc>
+        <w:tc>
+          <w:tcPr>
+            <w:tcW w:type="dxa" w:w="1020"/>
+            <w:vAlign w:val="center"/>
+          </w:tcPr>
+          <w:p>
+            <w:pPr>
+              <w:spacing w:before="20" w:after="20" w:line="240" w:lineRule="auto"/>
+              <w:jc w:val="center"/>
+            </w:pPr>
+            <w:r>
+              <w:rPr>
+                <w:rFonts w:ascii="Arial" w:hAnsi="Arial" w:eastAsia="Arial"/>
+                <w:b w:val="0"/>
+                <w:i w:val="0"/>
+                <w:sz w:val="16"/>
+              </w:rPr>
+              <w:t>A2</w:t>
+            </w:r>
+          </w:p>
+        </w:tc>
+        <w:tc>
+          <w:tcPr>
+            <w:tcW w:type="dxa" w:w="1077"/>
+            <w:vAlign w:val="center"/>
+          </w:tcPr>
+          <w:p>
+            <w:pPr>
+              <w:spacing w:before="20" w:after="20" w:line="240" w:lineRule="auto"/>
+              <w:jc w:val="center"/>
+            </w:pPr>
+            <w:r>
+              <w:rPr>
+                <w:rFonts w:ascii="Arial" w:hAnsi="Arial" w:eastAsia="Arial"/>
+                <w:b w:val="0"/>
+                <w:i w:val="0"/>
+                <w:sz w:val="16"/>
+              </w:rPr>
+              <w:t>INDICADA</w:t>
+            </w:r>
+          </w:p>
+        </w:tc>
+      </w:tr>
+      <w:tr>
+        <w:trPr>
+          <w:cantSplit/>
+        </w:trPr>
+        <w:tc>
+          <w:tcPr>
+            <w:tcW w:type="dxa" w:w="454"/>
+            <w:vAlign w:val="center"/>
+          </w:tcPr>
+          <w:p>
+            <w:pPr>
+              <w:spacing w:before="20" w:after="20" w:line="240" w:lineRule="auto"/>
+              <w:jc w:val="center"/>
+            </w:pPr>
+            <w:r>
+              <w:rPr>
+                <w:rFonts w:ascii="Arial" w:hAnsi="Arial" w:eastAsia="Arial"/>
+                <w:b w:val="0"/>
+                <w:i w:val="0"/>
+                <w:sz w:val="16"/>
+              </w:rPr>
+              <w:t>22</w:t>
+            </w:r>
+          </w:p>
+        </w:tc>
+        <w:tc>
+          <w:tcPr>
+            <w:tcW w:type="dxa" w:w="907"/>
+            <w:vAlign w:val="center"/>
+          </w:tcPr>
+          <w:p>
+            <w:pPr>
+              <w:spacing w:before="20" w:after="20" w:line="240" w:lineRule="auto"/>
+              <w:jc w:val="center"/>
+            </w:pPr>
+            <w:r>
+              <w:rPr>
+                <w:rFonts w:ascii="Arial" w:hAnsi="Arial" w:eastAsia="Arial"/>
+                <w:b/>
+                <w:i w:val="0"/>
+                <w:color w:val="7B1E2B"/>
+                <w:sz w:val="16"/>
+              </w:rPr>
+              <w:t>DPLV-22</w:t>
+            </w:r>
+          </w:p>
+        </w:tc>
+        <w:tc>
+          <w:tcPr>
+            <w:tcW w:type="dxa" w:w="6407"/>
+            <w:vAlign w:val="center"/>
+          </w:tcPr>
+          <w:p>
+            <w:pPr>
+              <w:spacing w:before="20" w:after="20" w:line="240" w:lineRule="auto"/>
+              <w:jc w:val="left"/>
+            </w:pPr>
+            <w:r>
+              <w:rPr>
+                <w:rFonts w:ascii="Arial" w:hAnsi="Arial" w:eastAsia="Arial"/>
+                <w:b/>
+                <w:i w:val="0"/>
+                <w:sz w:val="16"/>
+              </w:rPr>
+              <w:t>SECCIONES TRANSVERSALES DEL COLECTOR</w:t>
+            </w:r>
+          </w:p>
+          <w:p>
+            <w:pPr>
+              <w:spacing w:before="0" w:after="20" w:line="240" w:lineRule="auto"/>
+              <w:jc w:val="left"/>
+            </w:pPr>
+            <w:r>
+              <w:rPr>
+                <w:rFonts w:ascii="Arial" w:hAnsi="Arial" w:eastAsia="Arial"/>
+                <w:b w:val="0"/>
+                <w:i w:val="0"/>
+                <w:color w:val="595959"/>
+                <w:sz w:val="13"/>
+              </w:rPr>
+              <w:t>SECCIONES S-05 A S-08</w:t>
+            </w:r>
+          </w:p>
+        </w:tc>
+        <w:tc>
+          <w:tcPr>
+            <w:tcW w:type="dxa" w:w="1020"/>
+            <w:vAlign w:val="center"/>
+          </w:tcPr>
+          <w:p>
+            <w:pPr>
+              <w:spacing w:before="20" w:after="20" w:line="240" w:lineRule="auto"/>
+              <w:jc w:val="center"/>
+            </w:pPr>
+            <w:r>
+              <w:rPr>
+                <w:rFonts w:ascii="Arial" w:hAnsi="Arial" w:eastAsia="Arial"/>
+                <w:b w:val="0"/>
+                <w:i w:val="0"/>
+                <w:sz w:val="16"/>
+              </w:rPr>
+              <w:t>A2</w:t>
+            </w:r>
+          </w:p>
+        </w:tc>
+        <w:tc>
+          <w:tcPr>
+            <w:tcW w:type="dxa" w:w="1077"/>
+            <w:vAlign w:val="center"/>
+          </w:tcPr>
+          <w:p>
+            <w:pPr>
+              <w:spacing w:before="20" w:after="20" w:line="240" w:lineRule="auto"/>
+              <w:jc w:val="center"/>
+            </w:pPr>
+            <w:r>
+              <w:rPr>
+                <w:rFonts w:ascii="Arial" w:hAnsi="Arial" w:eastAsia="Arial"/>
+                <w:b w:val="0"/>
+                <w:i w:val="0"/>
+                <w:sz w:val="16"/>
+              </w:rPr>
+              <w:t>INDICADA</w:t>
+            </w:r>
+          </w:p>
+        </w:tc>
+      </w:tr>
+      <w:tr>
+        <w:trPr>
+          <w:cantSplit/>
+        </w:trPr>
+        <w:tc>
+          <w:tcPr>
+            <w:tcW w:type="dxa" w:w="454"/>
+            <w:vAlign w:val="center"/>
+          </w:tcPr>
+          <w:p>
+            <w:pPr>
+              <w:spacing w:before="20" w:after="20" w:line="240" w:lineRule="auto"/>
+              <w:jc w:val="center"/>
+            </w:pPr>
+            <w:r>
+              <w:rPr>
+                <w:rFonts w:ascii="Arial" w:hAnsi="Arial" w:eastAsia="Arial"/>
+                <w:b w:val="0"/>
+                <w:i w:val="0"/>
+                <w:sz w:val="16"/>
+              </w:rPr>
+              <w:t>23</w:t>
             </w:r>
           </w:p>
         </w:tc>
@@ -2425,1163 +3272,7 @@
                 <w:i w:val="0"/>
                 <w:sz w:val="16"/>
               </w:rPr>
-              <w:t>17</w:t>
-            </w:r>
-          </w:p>
-        </w:tc>
-        <w:tc>
-          <w:tcPr>
-            <w:tcW w:type="dxa" w:w="907"/>
-            <w:vAlign w:val="center"/>
-          </w:tcPr>
-          <w:p>
-            <w:pPr>
-              <w:spacing w:before="20" w:after="20" w:line="240" w:lineRule="auto"/>
-              <w:jc w:val="center"/>
-            </w:pPr>
-            <w:r>
-              <w:rPr>
-                <w:rFonts w:ascii="Arial" w:hAnsi="Arial" w:eastAsia="Arial"/>
-                <w:b/>
-                <w:i w:val="0"/>
-                <w:color w:val="7B1E2B"/>
-                <w:sz w:val="16"/>
-              </w:rPr>
-              <w:t>DPLV-25</w:t>
-            </w:r>
-          </w:p>
-        </w:tc>
-        <w:tc>
-          <w:tcPr>
-            <w:tcW w:type="dxa" w:w="6407"/>
-            <w:vAlign w:val="center"/>
-          </w:tcPr>
-          <w:p>
-            <w:pPr>
-              <w:spacing w:before="20" w:after="20" w:line="240" w:lineRule="auto"/>
-              <w:jc w:val="left"/>
-            </w:pPr>
-            <w:r>
-              <w:rPr>
-                <w:rFonts w:ascii="Arial" w:hAnsi="Arial" w:eastAsia="Arial"/>
-                <w:b/>
-                <w:i w:val="0"/>
-                <w:sz w:val="16"/>
-              </w:rPr>
-              <w:t>EMPALME DEL COLECTOR CON LA CAJA DE LLEGADA CL DEL HOGAR DE REFUGIO</w:t>
-            </w:r>
-          </w:p>
-        </w:tc>
-        <w:tc>
-          <w:tcPr>
-            <w:tcW w:type="dxa" w:w="1020"/>
-            <w:vAlign w:val="center"/>
-          </w:tcPr>
-          <w:p>
-            <w:pPr>
-              <w:spacing w:before="20" w:after="20" w:line="240" w:lineRule="auto"/>
-              <w:jc w:val="center"/>
-            </w:pPr>
-            <w:r>
-              <w:rPr>
-                <w:rFonts w:ascii="Arial" w:hAnsi="Arial" w:eastAsia="Arial"/>
-                <w:b w:val="0"/>
-                <w:i w:val="0"/>
-                <w:sz w:val="16"/>
-              </w:rPr>
-              <w:t>A1</w:t>
-            </w:r>
-          </w:p>
-        </w:tc>
-        <w:tc>
-          <w:tcPr>
-            <w:tcW w:type="dxa" w:w="1077"/>
-            <w:vAlign w:val="center"/>
-          </w:tcPr>
-          <w:p>
-            <w:pPr>
-              <w:spacing w:before="20" w:after="20" w:line="240" w:lineRule="auto"/>
-              <w:jc w:val="center"/>
-            </w:pPr>
-            <w:r>
-              <w:rPr>
-                <w:rFonts w:ascii="Arial" w:hAnsi="Arial" w:eastAsia="Arial"/>
-                <w:b w:val="0"/>
-                <w:i w:val="0"/>
-                <w:sz w:val="16"/>
-              </w:rPr>
-              <w:t>INDICADA</w:t>
-            </w:r>
-          </w:p>
-        </w:tc>
-      </w:tr>
-      <w:tr>
-        <w:trPr>
-          <w:cantSplit/>
-        </w:trPr>
-        <w:tc>
-          <w:tcPr>
-            <w:tcW w:type="dxa" w:w="9864"/>
-            <w:gridSpan w:val="5"/>
-            <w:shd w:val="clear" w:color="auto" w:fill="F2E6E8"/>
-            <w:vAlign w:val="center"/>
-          </w:tcPr>
-          <w:p>
-            <w:pPr>
-              <w:spacing w:before="20" w:after="20" w:line="240" w:lineRule="auto"/>
-              <w:jc w:val="left"/>
-            </w:pPr>
-            <w:r>
-              <w:rPr>
-                <w:rFonts w:ascii="Arial" w:hAnsi="Arial" w:eastAsia="Arial"/>
-                <w:b/>
-                <w:i w:val="0"/>
-                <w:color w:val="7B1E2B"/>
-                <w:sz w:val="15"/>
-              </w:rPr>
-              <w:t>LÁMINAS EN FORMATO A2  (19)</w:t>
-            </w:r>
-          </w:p>
-        </w:tc>
-      </w:tr>
-      <w:tr>
-        <w:trPr>
-          <w:cantSplit/>
-        </w:trPr>
-        <w:tc>
-          <w:tcPr>
-            <w:tcW w:type="dxa" w:w="454"/>
-            <w:vAlign w:val="center"/>
-          </w:tcPr>
-          <w:p>
-            <w:pPr>
-              <w:spacing w:before="20" w:after="20" w:line="240" w:lineRule="auto"/>
-              <w:jc w:val="center"/>
-            </w:pPr>
-            <w:r>
-              <w:rPr>
-                <w:rFonts w:ascii="Arial" w:hAnsi="Arial" w:eastAsia="Arial"/>
-                <w:b w:val="0"/>
-                <w:i w:val="0"/>
-                <w:sz w:val="16"/>
-              </w:rPr>
-              <w:t>18</w:t>
-            </w:r>
-          </w:p>
-        </w:tc>
-        <w:tc>
-          <w:tcPr>
-            <w:tcW w:type="dxa" w:w="907"/>
-            <w:vAlign w:val="center"/>
-          </w:tcPr>
-          <w:p>
-            <w:pPr>
-              <w:spacing w:before="20" w:after="20" w:line="240" w:lineRule="auto"/>
-              <w:jc w:val="center"/>
-            </w:pPr>
-            <w:r>
-              <w:rPr>
-                <w:rFonts w:ascii="Arial" w:hAnsi="Arial" w:eastAsia="Arial"/>
-                <w:b/>
-                <w:i w:val="0"/>
-                <w:color w:val="7B1E2B"/>
-                <w:sz w:val="16"/>
-              </w:rPr>
-              <w:t>DPLV-02</w:t>
-            </w:r>
-          </w:p>
-        </w:tc>
-        <w:tc>
-          <w:tcPr>
-            <w:tcW w:type="dxa" w:w="6407"/>
-            <w:vAlign w:val="center"/>
-          </w:tcPr>
-          <w:p>
-            <w:pPr>
-              <w:spacing w:before="20" w:after="20" w:line="240" w:lineRule="auto"/>
-              <w:jc w:val="left"/>
-            </w:pPr>
-            <w:r>
-              <w:rPr>
-                <w:rFonts w:ascii="Arial" w:hAnsi="Arial" w:eastAsia="Arial"/>
-                <w:b/>
-                <w:i w:val="0"/>
-                <w:sz w:val="16"/>
-              </w:rPr>
-              <w:t>SECCIONES TRANSVERSALES 01</w:t>
-            </w:r>
-          </w:p>
-          <w:p>
-            <w:pPr>
-              <w:spacing w:before="0" w:after="20" w:line="240" w:lineRule="auto"/>
-              <w:jc w:val="left"/>
-            </w:pPr>
-            <w:r>
-              <w:rPr>
-                <w:rFonts w:ascii="Arial" w:hAnsi="Arial" w:eastAsia="Arial"/>
-                <w:b w:val="0"/>
-                <w:i w:val="0"/>
-                <w:color w:val="595959"/>
-                <w:sz w:val="13"/>
-              </w:rPr>
-              <w:t>SECCIONES 01 A 15</w:t>
-            </w:r>
-          </w:p>
-        </w:tc>
-        <w:tc>
-          <w:tcPr>
-            <w:tcW w:type="dxa" w:w="1020"/>
-            <w:vAlign w:val="center"/>
-          </w:tcPr>
-          <w:p>
-            <w:pPr>
-              <w:spacing w:before="20" w:after="20" w:line="240" w:lineRule="auto"/>
-              <w:jc w:val="center"/>
-            </w:pPr>
-            <w:r>
-              <w:rPr>
-                <w:rFonts w:ascii="Arial" w:hAnsi="Arial" w:eastAsia="Arial"/>
-                <w:b w:val="0"/>
-                <w:i w:val="0"/>
-                <w:sz w:val="16"/>
-              </w:rPr>
-              <w:t>A2</w:t>
-            </w:r>
-          </w:p>
-        </w:tc>
-        <w:tc>
-          <w:tcPr>
-            <w:tcW w:type="dxa" w:w="1077"/>
-            <w:vAlign w:val="center"/>
-          </w:tcPr>
-          <w:p>
-            <w:pPr>
-              <w:spacing w:before="20" w:after="20" w:line="240" w:lineRule="auto"/>
-              <w:jc w:val="center"/>
-            </w:pPr>
-            <w:r>
-              <w:rPr>
-                <w:rFonts w:ascii="Arial" w:hAnsi="Arial" w:eastAsia="Arial"/>
-                <w:b w:val="0"/>
-                <w:i w:val="0"/>
-                <w:sz w:val="16"/>
-              </w:rPr>
-              <w:t>INDICADA</w:t>
-            </w:r>
-          </w:p>
-        </w:tc>
-      </w:tr>
-      <w:tr>
-        <w:trPr>
-          <w:cantSplit/>
-        </w:trPr>
-        <w:tc>
-          <w:tcPr>
-            <w:tcW w:type="dxa" w:w="454"/>
-            <w:vAlign w:val="center"/>
-          </w:tcPr>
-          <w:p>
-            <w:pPr>
-              <w:spacing w:before="20" w:after="20" w:line="240" w:lineRule="auto"/>
-              <w:jc w:val="center"/>
-            </w:pPr>
-            <w:r>
-              <w:rPr>
-                <w:rFonts w:ascii="Arial" w:hAnsi="Arial" w:eastAsia="Arial"/>
-                <w:b w:val="0"/>
-                <w:i w:val="0"/>
-                <w:sz w:val="16"/>
-              </w:rPr>
-              <w:t>19</w:t>
-            </w:r>
-          </w:p>
-        </w:tc>
-        <w:tc>
-          <w:tcPr>
-            <w:tcW w:type="dxa" w:w="907"/>
-            <w:vAlign w:val="center"/>
-          </w:tcPr>
-          <w:p>
-            <w:pPr>
-              <w:spacing w:before="20" w:after="20" w:line="240" w:lineRule="auto"/>
-              <w:jc w:val="center"/>
-            </w:pPr>
-            <w:r>
-              <w:rPr>
-                <w:rFonts w:ascii="Arial" w:hAnsi="Arial" w:eastAsia="Arial"/>
-                <w:b/>
-                <w:i w:val="0"/>
-                <w:color w:val="7B1E2B"/>
-                <w:sz w:val="16"/>
-              </w:rPr>
-              <w:t>DPLV-03</w:t>
-            </w:r>
-          </w:p>
-        </w:tc>
-        <w:tc>
-          <w:tcPr>
-            <w:tcW w:type="dxa" w:w="6407"/>
-            <w:vAlign w:val="center"/>
-          </w:tcPr>
-          <w:p>
-            <w:pPr>
-              <w:spacing w:before="20" w:after="20" w:line="240" w:lineRule="auto"/>
-              <w:jc w:val="left"/>
-            </w:pPr>
-            <w:r>
-              <w:rPr>
-                <w:rFonts w:ascii="Arial" w:hAnsi="Arial" w:eastAsia="Arial"/>
-                <w:b/>
-                <w:i w:val="0"/>
-                <w:sz w:val="16"/>
-              </w:rPr>
-              <w:t>SECCIONES TRANSVERSALES 02</w:t>
-            </w:r>
-          </w:p>
-          <w:p>
-            <w:pPr>
-              <w:spacing w:before="0" w:after="20" w:line="240" w:lineRule="auto"/>
-              <w:jc w:val="left"/>
-            </w:pPr>
-            <w:r>
-              <w:rPr>
-                <w:rFonts w:ascii="Arial" w:hAnsi="Arial" w:eastAsia="Arial"/>
-                <w:b w:val="0"/>
-                <w:i w:val="0"/>
-                <w:color w:val="595959"/>
-                <w:sz w:val="13"/>
-              </w:rPr>
-              <w:t>SECCIONES 16 A 30</w:t>
-            </w:r>
-          </w:p>
-        </w:tc>
-        <w:tc>
-          <w:tcPr>
-            <w:tcW w:type="dxa" w:w="1020"/>
-            <w:vAlign w:val="center"/>
-          </w:tcPr>
-          <w:p>
-            <w:pPr>
-              <w:spacing w:before="20" w:after="20" w:line="240" w:lineRule="auto"/>
-              <w:jc w:val="center"/>
-            </w:pPr>
-            <w:r>
-              <w:rPr>
-                <w:rFonts w:ascii="Arial" w:hAnsi="Arial" w:eastAsia="Arial"/>
-                <w:b w:val="0"/>
-                <w:i w:val="0"/>
-                <w:sz w:val="16"/>
-              </w:rPr>
-              <w:t>A2</w:t>
-            </w:r>
-          </w:p>
-        </w:tc>
-        <w:tc>
-          <w:tcPr>
-            <w:tcW w:type="dxa" w:w="1077"/>
-            <w:vAlign w:val="center"/>
-          </w:tcPr>
-          <w:p>
-            <w:pPr>
-              <w:spacing w:before="20" w:after="20" w:line="240" w:lineRule="auto"/>
-              <w:jc w:val="center"/>
-            </w:pPr>
-            <w:r>
-              <w:rPr>
-                <w:rFonts w:ascii="Arial" w:hAnsi="Arial" w:eastAsia="Arial"/>
-                <w:b w:val="0"/>
-                <w:i w:val="0"/>
-                <w:sz w:val="16"/>
-              </w:rPr>
-              <w:t>INDICADA</w:t>
-            </w:r>
-          </w:p>
-        </w:tc>
-      </w:tr>
-      <w:tr>
-        <w:trPr>
-          <w:cantSplit/>
-        </w:trPr>
-        <w:tc>
-          <w:tcPr>
-            <w:tcW w:type="dxa" w:w="454"/>
-            <w:vAlign w:val="center"/>
-          </w:tcPr>
-          <w:p>
-            <w:pPr>
-              <w:spacing w:before="20" w:after="20" w:line="240" w:lineRule="auto"/>
-              <w:jc w:val="center"/>
-            </w:pPr>
-            <w:r>
-              <w:rPr>
-                <w:rFonts w:ascii="Arial" w:hAnsi="Arial" w:eastAsia="Arial"/>
-                <w:b w:val="0"/>
-                <w:i w:val="0"/>
-                <w:sz w:val="16"/>
-              </w:rPr>
-              <w:t>20</w:t>
-            </w:r>
-          </w:p>
-        </w:tc>
-        <w:tc>
-          <w:tcPr>
-            <w:tcW w:type="dxa" w:w="907"/>
-            <w:vAlign w:val="center"/>
-          </w:tcPr>
-          <w:p>
-            <w:pPr>
-              <w:spacing w:before="20" w:after="20" w:line="240" w:lineRule="auto"/>
-              <w:jc w:val="center"/>
-            </w:pPr>
-            <w:r>
-              <w:rPr>
-                <w:rFonts w:ascii="Arial" w:hAnsi="Arial" w:eastAsia="Arial"/>
-                <w:b/>
-                <w:i w:val="0"/>
-                <w:color w:val="7B1E2B"/>
-                <w:sz w:val="16"/>
-              </w:rPr>
-              <w:t>DPLV-04</w:t>
-            </w:r>
-          </w:p>
-        </w:tc>
-        <w:tc>
-          <w:tcPr>
-            <w:tcW w:type="dxa" w:w="6407"/>
-            <w:vAlign w:val="center"/>
-          </w:tcPr>
-          <w:p>
-            <w:pPr>
-              <w:spacing w:before="20" w:after="20" w:line="240" w:lineRule="auto"/>
-              <w:jc w:val="left"/>
-            </w:pPr>
-            <w:r>
-              <w:rPr>
-                <w:rFonts w:ascii="Arial" w:hAnsi="Arial" w:eastAsia="Arial"/>
-                <w:b/>
-                <w:i w:val="0"/>
-                <w:sz w:val="16"/>
-              </w:rPr>
-              <w:t>SECCIONES TRANSVERSALES 03</w:t>
-            </w:r>
-          </w:p>
-          <w:p>
-            <w:pPr>
-              <w:spacing w:before="0" w:after="20" w:line="240" w:lineRule="auto"/>
-              <w:jc w:val="left"/>
-            </w:pPr>
-            <w:r>
-              <w:rPr>
-                <w:rFonts w:ascii="Arial" w:hAnsi="Arial" w:eastAsia="Arial"/>
-                <w:b w:val="0"/>
-                <w:i w:val="0"/>
-                <w:color w:val="595959"/>
-                <w:sz w:val="13"/>
-              </w:rPr>
-              <w:t>SECCIONES 31 A 43</w:t>
-            </w:r>
-          </w:p>
-        </w:tc>
-        <w:tc>
-          <w:tcPr>
-            <w:tcW w:type="dxa" w:w="1020"/>
-            <w:vAlign w:val="center"/>
-          </w:tcPr>
-          <w:p>
-            <w:pPr>
-              <w:spacing w:before="20" w:after="20" w:line="240" w:lineRule="auto"/>
-              <w:jc w:val="center"/>
-            </w:pPr>
-            <w:r>
-              <w:rPr>
-                <w:rFonts w:ascii="Arial" w:hAnsi="Arial" w:eastAsia="Arial"/>
-                <w:b w:val="0"/>
-                <w:i w:val="0"/>
-                <w:sz w:val="16"/>
-              </w:rPr>
-              <w:t>A2</w:t>
-            </w:r>
-          </w:p>
-        </w:tc>
-        <w:tc>
-          <w:tcPr>
-            <w:tcW w:type="dxa" w:w="1077"/>
-            <w:vAlign w:val="center"/>
-          </w:tcPr>
-          <w:p>
-            <w:pPr>
-              <w:spacing w:before="20" w:after="20" w:line="240" w:lineRule="auto"/>
-              <w:jc w:val="center"/>
-            </w:pPr>
-            <w:r>
-              <w:rPr>
-                <w:rFonts w:ascii="Arial" w:hAnsi="Arial" w:eastAsia="Arial"/>
-                <w:b w:val="0"/>
-                <w:i w:val="0"/>
-                <w:sz w:val="16"/>
-              </w:rPr>
-              <w:t>INDICADA</w:t>
-            </w:r>
-          </w:p>
-        </w:tc>
-      </w:tr>
-      <w:tr>
-        <w:trPr>
-          <w:cantSplit/>
-        </w:trPr>
-        <w:tc>
-          <w:tcPr>
-            <w:tcW w:type="dxa" w:w="454"/>
-            <w:vAlign w:val="center"/>
-          </w:tcPr>
-          <w:p>
-            <w:pPr>
-              <w:spacing w:before="20" w:after="20" w:line="240" w:lineRule="auto"/>
-              <w:jc w:val="center"/>
-            </w:pPr>
-            <w:r>
-              <w:rPr>
-                <w:rFonts w:ascii="Arial" w:hAnsi="Arial" w:eastAsia="Arial"/>
-                <w:b w:val="0"/>
-                <w:i w:val="0"/>
-                <w:sz w:val="16"/>
-              </w:rPr>
-              <w:t>21</w:t>
-            </w:r>
-          </w:p>
-        </w:tc>
-        <w:tc>
-          <w:tcPr>
-            <w:tcW w:type="dxa" w:w="907"/>
-            <w:vAlign w:val="center"/>
-          </w:tcPr>
-          <w:p>
-            <w:pPr>
-              <w:spacing w:before="20" w:after="20" w:line="240" w:lineRule="auto"/>
-              <w:jc w:val="center"/>
-            </w:pPr>
-            <w:r>
-              <w:rPr>
-                <w:rFonts w:ascii="Arial" w:hAnsi="Arial" w:eastAsia="Arial"/>
-                <w:b/>
-                <w:i w:val="0"/>
-                <w:color w:val="7B1E2B"/>
-                <w:sz w:val="16"/>
-              </w:rPr>
-              <w:t>DPLV-06</w:t>
-            </w:r>
-          </w:p>
-        </w:tc>
-        <w:tc>
-          <w:tcPr>
-            <w:tcW w:type="dxa" w:w="6407"/>
-            <w:vAlign w:val="center"/>
-          </w:tcPr>
-          <w:p>
-            <w:pPr>
-              <w:spacing w:before="20" w:after="20" w:line="240" w:lineRule="auto"/>
-              <w:jc w:val="left"/>
-            </w:pPr>
-            <w:r>
-              <w:rPr>
-                <w:rFonts w:ascii="Arial" w:hAnsi="Arial" w:eastAsia="Arial"/>
-                <w:b/>
-                <w:i w:val="0"/>
-                <w:sz w:val="16"/>
-              </w:rPr>
-              <w:t>PERFILES LONGITUDINALES 02</w:t>
-            </w:r>
-          </w:p>
-          <w:p>
-            <w:pPr>
-              <w:spacing w:before="0" w:after="20" w:line="240" w:lineRule="auto"/>
-              <w:jc w:val="left"/>
-            </w:pPr>
-            <w:r>
-              <w:rPr>
-                <w:rFonts w:ascii="Arial" w:hAnsi="Arial" w:eastAsia="Arial"/>
-                <w:b w:val="0"/>
-                <w:i w:val="0"/>
-                <w:color w:val="595959"/>
-                <w:sz w:val="13"/>
-              </w:rPr>
-              <w:t>EJES 07 A 09, CON LAS SECCIONES 31 A 42</w:t>
-            </w:r>
-          </w:p>
-        </w:tc>
-        <w:tc>
-          <w:tcPr>
-            <w:tcW w:type="dxa" w:w="1020"/>
-            <w:vAlign w:val="center"/>
-          </w:tcPr>
-          <w:p>
-            <w:pPr>
-              <w:spacing w:before="20" w:after="20" w:line="240" w:lineRule="auto"/>
-              <w:jc w:val="center"/>
-            </w:pPr>
-            <w:r>
-              <w:rPr>
-                <w:rFonts w:ascii="Arial" w:hAnsi="Arial" w:eastAsia="Arial"/>
-                <w:b w:val="0"/>
-                <w:i w:val="0"/>
-                <w:sz w:val="16"/>
-              </w:rPr>
-              <w:t>A2</w:t>
-            </w:r>
-          </w:p>
-        </w:tc>
-        <w:tc>
-          <w:tcPr>
-            <w:tcW w:type="dxa" w:w="1077"/>
-            <w:vAlign w:val="center"/>
-          </w:tcPr>
-          <w:p>
-            <w:pPr>
-              <w:spacing w:before="20" w:after="20" w:line="240" w:lineRule="auto"/>
-              <w:jc w:val="center"/>
-            </w:pPr>
-            <w:r>
-              <w:rPr>
-                <w:rFonts w:ascii="Arial" w:hAnsi="Arial" w:eastAsia="Arial"/>
-                <w:b w:val="0"/>
-                <w:i w:val="0"/>
-                <w:sz w:val="16"/>
-              </w:rPr>
-              <w:t>INDICADA</w:t>
-            </w:r>
-          </w:p>
-        </w:tc>
-      </w:tr>
-      <w:tr>
-        <w:trPr>
-          <w:cantSplit/>
-        </w:trPr>
-        <w:tc>
-          <w:tcPr>
-            <w:tcW w:type="dxa" w:w="454"/>
-            <w:vAlign w:val="center"/>
-          </w:tcPr>
-          <w:p>
-            <w:pPr>
-              <w:spacing w:before="20" w:after="20" w:line="240" w:lineRule="auto"/>
-              <w:jc w:val="center"/>
-            </w:pPr>
-            <w:r>
-              <w:rPr>
-                <w:rFonts w:ascii="Arial" w:hAnsi="Arial" w:eastAsia="Arial"/>
-                <w:b w:val="0"/>
-                <w:i w:val="0"/>
-                <w:sz w:val="16"/>
-              </w:rPr>
-              <w:t>22</w:t>
-            </w:r>
-          </w:p>
-        </w:tc>
-        <w:tc>
-          <w:tcPr>
-            <w:tcW w:type="dxa" w:w="907"/>
-            <w:vAlign w:val="center"/>
-          </w:tcPr>
-          <w:p>
-            <w:pPr>
-              <w:spacing w:before="20" w:after="20" w:line="240" w:lineRule="auto"/>
-              <w:jc w:val="center"/>
-            </w:pPr>
-            <w:r>
-              <w:rPr>
-                <w:rFonts w:ascii="Arial" w:hAnsi="Arial" w:eastAsia="Arial"/>
-                <w:b/>
-                <w:i w:val="0"/>
-                <w:color w:val="7B1E2B"/>
-                <w:sz w:val="16"/>
-              </w:rPr>
-              <w:t>DPLV-19</w:t>
-            </w:r>
-          </w:p>
-        </w:tc>
-        <w:tc>
-          <w:tcPr>
-            <w:tcW w:type="dxa" w:w="6407"/>
-            <w:vAlign w:val="center"/>
-          </w:tcPr>
-          <w:p>
-            <w:pPr>
-              <w:spacing w:before="20" w:after="20" w:line="240" w:lineRule="auto"/>
-              <w:jc w:val="left"/>
-            </w:pPr>
-            <w:r>
-              <w:rPr>
-                <w:rFonts w:ascii="Arial" w:hAnsi="Arial" w:eastAsia="Arial"/>
-                <w:b/>
-                <w:i w:val="0"/>
-                <w:sz w:val="16"/>
-              </w:rPr>
-              <w:t>PERFIL LONGITUDINAL DETALLADO DEL COLECTOR</w:t>
-            </w:r>
-          </w:p>
-          <w:p>
-            <w:pPr>
-              <w:spacing w:before="0" w:after="20" w:line="240" w:lineRule="auto"/>
-              <w:jc w:val="left"/>
-            </w:pPr>
-            <w:r>
-              <w:rPr>
-                <w:rFonts w:ascii="Arial" w:hAnsi="Arial" w:eastAsia="Arial"/>
-                <w:b w:val="0"/>
-                <w:i w:val="0"/>
-                <w:color w:val="595959"/>
-                <w:sz w:val="13"/>
-              </w:rPr>
-              <w:t>TRAMOS 1 A 3: PROG. 0+000.00 A 0+053.70</w:t>
-            </w:r>
-          </w:p>
-        </w:tc>
-        <w:tc>
-          <w:tcPr>
-            <w:tcW w:type="dxa" w:w="1020"/>
-            <w:vAlign w:val="center"/>
-          </w:tcPr>
-          <w:p>
-            <w:pPr>
-              <w:spacing w:before="20" w:after="20" w:line="240" w:lineRule="auto"/>
-              <w:jc w:val="center"/>
-            </w:pPr>
-            <w:r>
-              <w:rPr>
-                <w:rFonts w:ascii="Arial" w:hAnsi="Arial" w:eastAsia="Arial"/>
-                <w:b w:val="0"/>
-                <w:i w:val="0"/>
-                <w:sz w:val="16"/>
-              </w:rPr>
-              <w:t>A2</w:t>
-            </w:r>
-          </w:p>
-        </w:tc>
-        <w:tc>
-          <w:tcPr>
-            <w:tcW w:type="dxa" w:w="1077"/>
-            <w:vAlign w:val="center"/>
-          </w:tcPr>
-          <w:p>
-            <w:pPr>
-              <w:spacing w:before="20" w:after="20" w:line="240" w:lineRule="auto"/>
-              <w:jc w:val="center"/>
-            </w:pPr>
-            <w:r>
-              <w:rPr>
-                <w:rFonts w:ascii="Arial" w:hAnsi="Arial" w:eastAsia="Arial"/>
-                <w:b w:val="0"/>
-                <w:i w:val="0"/>
-                <w:sz w:val="16"/>
-              </w:rPr>
-              <w:t>INDICADA</w:t>
-            </w:r>
-          </w:p>
-        </w:tc>
-      </w:tr>
-      <w:tr>
-        <w:trPr>
-          <w:cantSplit/>
-        </w:trPr>
-        <w:tc>
-          <w:tcPr>
-            <w:tcW w:type="dxa" w:w="454"/>
-            <w:vAlign w:val="center"/>
-          </w:tcPr>
-          <w:p>
-            <w:pPr>
-              <w:spacing w:before="20" w:after="20" w:line="240" w:lineRule="auto"/>
-              <w:jc w:val="center"/>
-            </w:pPr>
-            <w:r>
-              <w:rPr>
-                <w:rFonts w:ascii="Arial" w:hAnsi="Arial" w:eastAsia="Arial"/>
-                <w:b w:val="0"/>
-                <w:i w:val="0"/>
-                <w:sz w:val="16"/>
-              </w:rPr>
-              <w:t>23</w:t>
-            </w:r>
-          </w:p>
-        </w:tc>
-        <w:tc>
-          <w:tcPr>
-            <w:tcW w:type="dxa" w:w="907"/>
-            <w:vAlign w:val="center"/>
-          </w:tcPr>
-          <w:p>
-            <w:pPr>
-              <w:spacing w:before="20" w:after="20" w:line="240" w:lineRule="auto"/>
-              <w:jc w:val="center"/>
-            </w:pPr>
-            <w:r>
-              <w:rPr>
-                <w:rFonts w:ascii="Arial" w:hAnsi="Arial" w:eastAsia="Arial"/>
-                <w:b/>
-                <w:i w:val="0"/>
-                <w:color w:val="7B1E2B"/>
-                <w:sz w:val="16"/>
-              </w:rPr>
-              <w:t>DPLV-20</w:t>
-            </w:r>
-          </w:p>
-        </w:tc>
-        <w:tc>
-          <w:tcPr>
-            <w:tcW w:type="dxa" w:w="6407"/>
-            <w:vAlign w:val="center"/>
-          </w:tcPr>
-          <w:p>
-            <w:pPr>
-              <w:spacing w:before="20" w:after="20" w:line="240" w:lineRule="auto"/>
-              <w:jc w:val="left"/>
-            </w:pPr>
-            <w:r>
-              <w:rPr>
-                <w:rFonts w:ascii="Arial" w:hAnsi="Arial" w:eastAsia="Arial"/>
-                <w:b/>
-                <w:i w:val="0"/>
-                <w:sz w:val="16"/>
-              </w:rPr>
-              <w:t>PERFIL LONGITUDINAL DETALLADO DEL COLECTOR</w:t>
-            </w:r>
-          </w:p>
-          <w:p>
-            <w:pPr>
-              <w:spacing w:before="0" w:after="20" w:line="240" w:lineRule="auto"/>
-              <w:jc w:val="left"/>
-            </w:pPr>
-            <w:r>
-              <w:rPr>
-                <w:rFonts w:ascii="Arial" w:hAnsi="Arial" w:eastAsia="Arial"/>
-                <w:b w:val="0"/>
-                <w:i w:val="0"/>
-                <w:color w:val="595959"/>
-                <w:sz w:val="13"/>
-              </w:rPr>
-              <w:t>TRAMOS 4 A 6: PROG. 0+053.70 A 0+105.29</w:t>
-            </w:r>
-          </w:p>
-        </w:tc>
-        <w:tc>
-          <w:tcPr>
-            <w:tcW w:type="dxa" w:w="1020"/>
-            <w:vAlign w:val="center"/>
-          </w:tcPr>
-          <w:p>
-            <w:pPr>
-              <w:spacing w:before="20" w:after="20" w:line="240" w:lineRule="auto"/>
-              <w:jc w:val="center"/>
-            </w:pPr>
-            <w:r>
-              <w:rPr>
-                <w:rFonts w:ascii="Arial" w:hAnsi="Arial" w:eastAsia="Arial"/>
-                <w:b w:val="0"/>
-                <w:i w:val="0"/>
-                <w:sz w:val="16"/>
-              </w:rPr>
-              <w:t>A2</w:t>
-            </w:r>
-          </w:p>
-        </w:tc>
-        <w:tc>
-          <w:tcPr>
-            <w:tcW w:type="dxa" w:w="1077"/>
-            <w:vAlign w:val="center"/>
-          </w:tcPr>
-          <w:p>
-            <w:pPr>
-              <w:spacing w:before="20" w:after="20" w:line="240" w:lineRule="auto"/>
-              <w:jc w:val="center"/>
-            </w:pPr>
-            <w:r>
-              <w:rPr>
-                <w:rFonts w:ascii="Arial" w:hAnsi="Arial" w:eastAsia="Arial"/>
-                <w:b w:val="0"/>
-                <w:i w:val="0"/>
-                <w:sz w:val="16"/>
-              </w:rPr>
-              <w:t>INDICADA</w:t>
-            </w:r>
-          </w:p>
-        </w:tc>
-      </w:tr>
-      <w:tr>
-        <w:trPr>
-          <w:cantSplit/>
-        </w:trPr>
-        <w:tc>
-          <w:tcPr>
-            <w:tcW w:type="dxa" w:w="454"/>
-            <w:vAlign w:val="center"/>
-          </w:tcPr>
-          <w:p>
-            <w:pPr>
-              <w:spacing w:before="20" w:after="20" w:line="240" w:lineRule="auto"/>
-              <w:jc w:val="center"/>
-            </w:pPr>
-            <w:r>
-              <w:rPr>
-                <w:rFonts w:ascii="Arial" w:hAnsi="Arial" w:eastAsia="Arial"/>
-                <w:b w:val="0"/>
-                <w:i w:val="0"/>
-                <w:sz w:val="16"/>
-              </w:rPr>
               <w:t>24</w:t>
-            </w:r>
-          </w:p>
-        </w:tc>
-        <w:tc>
-          <w:tcPr>
-            <w:tcW w:type="dxa" w:w="907"/>
-            <w:vAlign w:val="center"/>
-          </w:tcPr>
-          <w:p>
-            <w:pPr>
-              <w:spacing w:before="20" w:after="20" w:line="240" w:lineRule="auto"/>
-              <w:jc w:val="center"/>
-            </w:pPr>
-            <w:r>
-              <w:rPr>
-                <w:rFonts w:ascii="Arial" w:hAnsi="Arial" w:eastAsia="Arial"/>
-                <w:b/>
-                <w:i w:val="0"/>
-                <w:color w:val="7B1E2B"/>
-                <w:sz w:val="16"/>
-              </w:rPr>
-              <w:t>DPLV-21</w:t>
-            </w:r>
-          </w:p>
-        </w:tc>
-        <w:tc>
-          <w:tcPr>
-            <w:tcW w:type="dxa" w:w="6407"/>
-            <w:vAlign w:val="center"/>
-          </w:tcPr>
-          <w:p>
-            <w:pPr>
-              <w:spacing w:before="20" w:after="20" w:line="240" w:lineRule="auto"/>
-              <w:jc w:val="left"/>
-            </w:pPr>
-            <w:r>
-              <w:rPr>
-                <w:rFonts w:ascii="Arial" w:hAnsi="Arial" w:eastAsia="Arial"/>
-                <w:b/>
-                <w:i w:val="0"/>
-                <w:sz w:val="16"/>
-              </w:rPr>
-              <w:t>SECCIONES TRANSVERSALES DEL COLECTOR</w:t>
-            </w:r>
-          </w:p>
-          <w:p>
-            <w:pPr>
-              <w:spacing w:before="0" w:after="20" w:line="240" w:lineRule="auto"/>
-              <w:jc w:val="left"/>
-            </w:pPr>
-            <w:r>
-              <w:rPr>
-                <w:rFonts w:ascii="Arial" w:hAnsi="Arial" w:eastAsia="Arial"/>
-                <w:b w:val="0"/>
-                <w:i w:val="0"/>
-                <w:color w:val="595959"/>
-                <w:sz w:val="13"/>
-              </w:rPr>
-              <w:t>SECCIONES S-01 A S-04</w:t>
-            </w:r>
-          </w:p>
-        </w:tc>
-        <w:tc>
-          <w:tcPr>
-            <w:tcW w:type="dxa" w:w="1020"/>
-            <w:vAlign w:val="center"/>
-          </w:tcPr>
-          <w:p>
-            <w:pPr>
-              <w:spacing w:before="20" w:after="20" w:line="240" w:lineRule="auto"/>
-              <w:jc w:val="center"/>
-            </w:pPr>
-            <w:r>
-              <w:rPr>
-                <w:rFonts w:ascii="Arial" w:hAnsi="Arial" w:eastAsia="Arial"/>
-                <w:b w:val="0"/>
-                <w:i w:val="0"/>
-                <w:sz w:val="16"/>
-              </w:rPr>
-              <w:t>A2</w:t>
-            </w:r>
-          </w:p>
-        </w:tc>
-        <w:tc>
-          <w:tcPr>
-            <w:tcW w:type="dxa" w:w="1077"/>
-            <w:vAlign w:val="center"/>
-          </w:tcPr>
-          <w:p>
-            <w:pPr>
-              <w:spacing w:before="20" w:after="20" w:line="240" w:lineRule="auto"/>
-              <w:jc w:val="center"/>
-            </w:pPr>
-            <w:r>
-              <w:rPr>
-                <w:rFonts w:ascii="Arial" w:hAnsi="Arial" w:eastAsia="Arial"/>
-                <w:b w:val="0"/>
-                <w:i w:val="0"/>
-                <w:sz w:val="16"/>
-              </w:rPr>
-              <w:t>INDICADA</w:t>
-            </w:r>
-          </w:p>
-        </w:tc>
-      </w:tr>
-      <w:tr>
-        <w:trPr>
-          <w:cantSplit/>
-        </w:trPr>
-        <w:tc>
-          <w:tcPr>
-            <w:tcW w:type="dxa" w:w="454"/>
-            <w:vAlign w:val="center"/>
-          </w:tcPr>
-          <w:p>
-            <w:pPr>
-              <w:spacing w:before="20" w:after="20" w:line="240" w:lineRule="auto"/>
-              <w:jc w:val="center"/>
-            </w:pPr>
-            <w:r>
-              <w:rPr>
-                <w:rFonts w:ascii="Arial" w:hAnsi="Arial" w:eastAsia="Arial"/>
-                <w:b w:val="0"/>
-                <w:i w:val="0"/>
-                <w:sz w:val="16"/>
-              </w:rPr>
-              <w:t>25</w:t>
-            </w:r>
-          </w:p>
-        </w:tc>
-        <w:tc>
-          <w:tcPr>
-            <w:tcW w:type="dxa" w:w="907"/>
-            <w:vAlign w:val="center"/>
-          </w:tcPr>
-          <w:p>
-            <w:pPr>
-              <w:spacing w:before="20" w:after="20" w:line="240" w:lineRule="auto"/>
-              <w:jc w:val="center"/>
-            </w:pPr>
-            <w:r>
-              <w:rPr>
-                <w:rFonts w:ascii="Arial" w:hAnsi="Arial" w:eastAsia="Arial"/>
-                <w:b/>
-                <w:i w:val="0"/>
-                <w:color w:val="7B1E2B"/>
-                <w:sz w:val="16"/>
-              </w:rPr>
-              <w:t>DPLV-22</w:t>
-            </w:r>
-          </w:p>
-        </w:tc>
-        <w:tc>
-          <w:tcPr>
-            <w:tcW w:type="dxa" w:w="6407"/>
-            <w:vAlign w:val="center"/>
-          </w:tcPr>
-          <w:p>
-            <w:pPr>
-              <w:spacing w:before="20" w:after="20" w:line="240" w:lineRule="auto"/>
-              <w:jc w:val="left"/>
-            </w:pPr>
-            <w:r>
-              <w:rPr>
-                <w:rFonts w:ascii="Arial" w:hAnsi="Arial" w:eastAsia="Arial"/>
-                <w:b/>
-                <w:i w:val="0"/>
-                <w:sz w:val="16"/>
-              </w:rPr>
-              <w:t>SECCIONES TRANSVERSALES DEL COLECTOR</w:t>
-            </w:r>
-          </w:p>
-          <w:p>
-            <w:pPr>
-              <w:spacing w:before="0" w:after="20" w:line="240" w:lineRule="auto"/>
-              <w:jc w:val="left"/>
-            </w:pPr>
-            <w:r>
-              <w:rPr>
-                <w:rFonts w:ascii="Arial" w:hAnsi="Arial" w:eastAsia="Arial"/>
-                <w:b w:val="0"/>
-                <w:i w:val="0"/>
-                <w:color w:val="595959"/>
-                <w:sz w:val="13"/>
-              </w:rPr>
-              <w:t>SECCIONES S-05 A S-08</w:t>
-            </w:r>
-          </w:p>
-        </w:tc>
-        <w:tc>
-          <w:tcPr>
-            <w:tcW w:type="dxa" w:w="1020"/>
-            <w:vAlign w:val="center"/>
-          </w:tcPr>
-          <w:p>
-            <w:pPr>
-              <w:spacing w:before="20" w:after="20" w:line="240" w:lineRule="auto"/>
-              <w:jc w:val="center"/>
-            </w:pPr>
-            <w:r>
-              <w:rPr>
-                <w:rFonts w:ascii="Arial" w:hAnsi="Arial" w:eastAsia="Arial"/>
-                <w:b w:val="0"/>
-                <w:i w:val="0"/>
-                <w:sz w:val="16"/>
-              </w:rPr>
-              <w:t>A2</w:t>
-            </w:r>
-          </w:p>
-        </w:tc>
-        <w:tc>
-          <w:tcPr>
-            <w:tcW w:type="dxa" w:w="1077"/>
-            <w:vAlign w:val="center"/>
-          </w:tcPr>
-          <w:p>
-            <w:pPr>
-              <w:spacing w:before="20" w:after="20" w:line="240" w:lineRule="auto"/>
-              <w:jc w:val="center"/>
-            </w:pPr>
-            <w:r>
-              <w:rPr>
-                <w:rFonts w:ascii="Arial" w:hAnsi="Arial" w:eastAsia="Arial"/>
-                <w:b w:val="0"/>
-                <w:i w:val="0"/>
-                <w:sz w:val="16"/>
-              </w:rPr>
-              <w:t>INDICADA</w:t>
-            </w:r>
-          </w:p>
-        </w:tc>
-      </w:tr>
-      <w:tr>
-        <w:trPr>
-          <w:cantSplit/>
-        </w:trPr>
-        <w:tc>
-          <w:tcPr>
-            <w:tcW w:type="dxa" w:w="454"/>
-            <w:vAlign w:val="center"/>
-          </w:tcPr>
-          <w:p>
-            <w:pPr>
-              <w:spacing w:before="20" w:after="20" w:line="240" w:lineRule="auto"/>
-              <w:jc w:val="center"/>
-            </w:pPr>
-            <w:r>
-              <w:rPr>
-                <w:rFonts w:ascii="Arial" w:hAnsi="Arial" w:eastAsia="Arial"/>
-                <w:b w:val="0"/>
-                <w:i w:val="0"/>
-                <w:sz w:val="16"/>
-              </w:rPr>
-              <w:t>26</w:t>
             </w:r>
           </w:p>
         </w:tc>
@@ -3692,7 +3383,118 @@
                 <w:i w:val="0"/>
                 <w:sz w:val="16"/>
               </w:rPr>
-              <w:t>27</w:t>
+              <w:t>25</w:t>
+            </w:r>
+          </w:p>
+        </w:tc>
+        <w:tc>
+          <w:tcPr>
+            <w:tcW w:type="dxa" w:w="907"/>
+            <w:vAlign w:val="center"/>
+          </w:tcPr>
+          <w:p>
+            <w:pPr>
+              <w:spacing w:before="20" w:after="20" w:line="240" w:lineRule="auto"/>
+              <w:jc w:val="center"/>
+            </w:pPr>
+            <w:r>
+              <w:rPr>
+                <w:rFonts w:ascii="Arial" w:hAnsi="Arial" w:eastAsia="Arial"/>
+                <w:b/>
+                <w:i w:val="0"/>
+                <w:color w:val="7B1E2B"/>
+                <w:sz w:val="16"/>
+              </w:rPr>
+              <w:t>DPLV-25</w:t>
+            </w:r>
+          </w:p>
+        </w:tc>
+        <w:tc>
+          <w:tcPr>
+            <w:tcW w:type="dxa" w:w="6407"/>
+            <w:vAlign w:val="center"/>
+          </w:tcPr>
+          <w:p>
+            <w:pPr>
+              <w:spacing w:before="20" w:after="20" w:line="240" w:lineRule="auto"/>
+              <w:jc w:val="left"/>
+            </w:pPr>
+            <w:r>
+              <w:rPr>
+                <w:rFonts w:ascii="Arial" w:hAnsi="Arial" w:eastAsia="Arial"/>
+                <w:b/>
+                <w:i w:val="0"/>
+                <w:sz w:val="16"/>
+              </w:rPr>
+              <w:t>EMPALME DEL COLECTOR CON LA CAJA DE LLEGADA CL DEL HOGAR DE REFUGIO</w:t>
+            </w:r>
+          </w:p>
+        </w:tc>
+        <w:tc>
+          <w:tcPr>
+            <w:tcW w:type="dxa" w:w="1020"/>
+            <w:vAlign w:val="center"/>
+          </w:tcPr>
+          <w:p>
+            <w:pPr>
+              <w:spacing w:before="20" w:after="20" w:line="240" w:lineRule="auto"/>
+              <w:jc w:val="center"/>
+            </w:pPr>
+            <w:r>
+              <w:rPr>
+                <w:rFonts w:ascii="Arial" w:hAnsi="Arial" w:eastAsia="Arial"/>
+                <w:b w:val="0"/>
+                <w:i w:val="0"/>
+                <w:sz w:val="16"/>
+              </w:rPr>
+              <w:t>A1</w:t>
+            </w:r>
+          </w:p>
+        </w:tc>
+        <w:tc>
+          <w:tcPr>
+            <w:tcW w:type="dxa" w:w="1077"/>
+            <w:vAlign w:val="center"/>
+          </w:tcPr>
+          <w:p>
+            <w:pPr>
+              <w:spacing w:before="20" w:after="20" w:line="240" w:lineRule="auto"/>
+              <w:jc w:val="center"/>
+            </w:pPr>
+            <w:r>
+              <w:rPr>
+                <w:rFonts w:ascii="Arial" w:hAnsi="Arial" w:eastAsia="Arial"/>
+                <w:b w:val="0"/>
+                <w:i w:val="0"/>
+                <w:sz w:val="16"/>
+              </w:rPr>
+              <w:t>INDICADA</w:t>
+            </w:r>
+          </w:p>
+        </w:tc>
+      </w:tr>
+      <w:tr>
+        <w:trPr>
+          <w:cantSplit/>
+        </w:trPr>
+        <w:tc>
+          <w:tcPr>
+            <w:tcW w:type="dxa" w:w="454"/>
+            <w:vAlign w:val="center"/>
+          </w:tcPr>
+          <w:p>
+            <w:pPr>
+              <w:spacing w:before="20" w:after="20" w:line="240" w:lineRule="auto"/>
+              <w:jc w:val="center"/>
+            </w:pPr>
+            <w:r>
+              <w:rPr>
+                <w:rFonts w:ascii="Arial" w:hAnsi="Arial" w:eastAsia="Arial"/>
+                <w:b w:val="0"/>
+                <w:i w:val="0"/>
+                <w:sz w:val="16"/>
+              </w:rPr>
+              <w:t>26</w:t>
             </w:r>
           </w:p>
         </w:tc>
@@ -3803,7 +3605,7 @@
                 <w:i w:val="0"/>
                 <w:sz w:val="16"/>
               </w:rPr>
-              <w:t>28</w:t>
+              <w:t>27</w:t>
             </w:r>
           </w:p>
         </w:tc>
@@ -3914,7 +3716,7 @@
                 <w:i w:val="0"/>
                 <w:sz w:val="16"/>
               </w:rPr>
-              <w:t>29</w:t>
+              <w:t>28</w:t>
             </w:r>
           </w:p>
         </w:tc>
@@ -4025,7 +3827,7 @@
                 <w:i w:val="0"/>
                 <w:sz w:val="16"/>
               </w:rPr>
-              <w:t>30</w:t>
+              <w:t>29</w:t>
             </w:r>
           </w:p>
         </w:tc>
@@ -4136,7 +3938,7 @@
                 <w:i w:val="0"/>
                 <w:sz w:val="16"/>
               </w:rPr>
-              <w:t>31</w:t>
+              <w:t>30</w:t>
             </w:r>
           </w:p>
         </w:tc>
@@ -4247,7 +4049,7 @@
                 <w:i w:val="0"/>
                 <w:sz w:val="16"/>
               </w:rPr>
-              <w:t>32</w:t>
+              <w:t>31</w:t>
             </w:r>
           </w:p>
         </w:tc>
@@ -4358,7 +4160,7 @@
                 <w:i w:val="0"/>
                 <w:sz w:val="16"/>
               </w:rPr>
-              <w:t>33</w:t>
+              <w:t>32</w:t>
             </w:r>
           </w:p>
         </w:tc>
@@ -4469,7 +4271,7 @@
                 <w:i w:val="0"/>
                 <w:sz w:val="16"/>
               </w:rPr>
-              <w:t>34</w:t>
+              <w:t>33</w:t>
             </w:r>
           </w:p>
         </w:tc>
@@ -4580,7 +4382,7 @@
                 <w:i w:val="0"/>
                 <w:sz w:val="16"/>
               </w:rPr>
-              <w:t>35</w:t>
+              <w:t>34</w:t>
             </w:r>
           </w:p>
         </w:tc>
@@ -4645,6 +4447,117 @@
                 <w:sz w:val="16"/>
               </w:rPr>
               <w:t>A2</w:t>
+            </w:r>
+          </w:p>
+        </w:tc>
+        <w:tc>
+          <w:tcPr>
+            <w:tcW w:type="dxa" w:w="1077"/>
+            <w:vAlign w:val="center"/>
+          </w:tcPr>
+          <w:p>
+            <w:pPr>
+              <w:spacing w:before="20" w:after="20" w:line="240" w:lineRule="auto"/>
+              <w:jc w:val="center"/>
+            </w:pPr>
+            <w:r>
+              <w:rPr>
+                <w:rFonts w:ascii="Arial" w:hAnsi="Arial" w:eastAsia="Arial"/>
+                <w:b w:val="0"/>
+                <w:i w:val="0"/>
+                <w:sz w:val="16"/>
+              </w:rPr>
+              <w:t>INDICADA</w:t>
+            </w:r>
+          </w:p>
+        </w:tc>
+      </w:tr>
+      <w:tr>
+        <w:trPr>
+          <w:cantSplit/>
+        </w:trPr>
+        <w:tc>
+          <w:tcPr>
+            <w:tcW w:type="dxa" w:w="454"/>
+            <w:vAlign w:val="center"/>
+          </w:tcPr>
+          <w:p>
+            <w:pPr>
+              <w:spacing w:before="20" w:after="20" w:line="240" w:lineRule="auto"/>
+              <w:jc w:val="center"/>
+            </w:pPr>
+            <w:r>
+              <w:rPr>
+                <w:rFonts w:ascii="Arial" w:hAnsi="Arial" w:eastAsia="Arial"/>
+                <w:b w:val="0"/>
+                <w:i w:val="0"/>
+                <w:sz w:val="16"/>
+              </w:rPr>
+              <w:t>35</w:t>
+            </w:r>
+          </w:p>
+        </w:tc>
+        <w:tc>
+          <w:tcPr>
+            <w:tcW w:type="dxa" w:w="907"/>
+            <w:vAlign w:val="center"/>
+          </w:tcPr>
+          <w:p>
+            <w:pPr>
+              <w:spacing w:before="20" w:after="20" w:line="240" w:lineRule="auto"/>
+              <w:jc w:val="center"/>
+            </w:pPr>
+            <w:r>
+              <w:rPr>
+                <w:rFonts w:ascii="Arial" w:hAnsi="Arial" w:eastAsia="Arial"/>
+                <w:b/>
+                <w:i w:val="0"/>
+                <w:color w:val="7B1E2B"/>
+                <w:sz w:val="16"/>
+              </w:rPr>
+              <w:t>DPLV-35</w:t>
+            </w:r>
+          </w:p>
+        </w:tc>
+        <w:tc>
+          <w:tcPr>
+            <w:tcW w:type="dxa" w:w="6407"/>
+            <w:vAlign w:val="center"/>
+          </w:tcPr>
+          <w:p>
+            <w:pPr>
+              <w:spacing w:before="20" w:after="20" w:line="240" w:lineRule="auto"/>
+              <w:jc w:val="left"/>
+            </w:pPr>
+            <w:r>
+              <w:rPr>
+                <w:rFonts w:ascii="Arial" w:hAnsi="Arial" w:eastAsia="Arial"/>
+                <w:b/>
+                <w:i w:val="0"/>
+                <w:sz w:val="16"/>
+              </w:rPr>
+              <w:t>DETALLE DE LLORADERO: CORTE, TUBO PERFORADO Y DESAGREGADO</w:t>
+            </w:r>
+          </w:p>
+        </w:tc>
+        <w:tc>
+          <w:tcPr>
+            <w:tcW w:type="dxa" w:w="1020"/>
+            <w:vAlign w:val="center"/>
+          </w:tcPr>
+          <w:p>
+            <w:pPr>
+              <w:spacing w:before="20" w:after="20" w:line="240" w:lineRule="auto"/>
+              <w:jc w:val="center"/>
+            </w:pPr>
+            <w:r>
+              <w:rPr>
+                <w:rFonts w:ascii="Arial" w:hAnsi="Arial" w:eastAsia="Arial"/>
+                <w:b w:val="0"/>
+                <w:i w:val="0"/>
+                <w:sz w:val="16"/>
+              </w:rPr>
+              <w:t>A3</w:t>
             </w:r>
           </w:p>
         </w:tc>
@@ -4787,35 +4700,6 @@
         </w:trPr>
         <w:tc>
           <w:tcPr>
-            <w:tcW w:type="dxa" w:w="9864"/>
-            <w:gridSpan w:val="5"/>
-            <w:shd w:val="clear" w:color="auto" w:fill="F2E6E8"/>
-            <w:vAlign w:val="center"/>
-          </w:tcPr>
-          <w:p>
-            <w:pPr>
-              <w:spacing w:before="20" w:after="20" w:line="240" w:lineRule="auto"/>
-              <w:jc w:val="left"/>
-            </w:pPr>
-            <w:r>
-              <w:rPr>
-                <w:rFonts w:ascii="Arial" w:hAnsi="Arial" w:eastAsia="Arial"/>
-                <w:b/>
-                <w:i w:val="0"/>
-                <w:color w:val="7B1E2B"/>
-                <w:sz w:val="15"/>
-              </w:rPr>
-              <w:t>LÁMINAS EN FORMATO A3  (8)</w:t>
-            </w:r>
-          </w:p>
-        </w:tc>
-      </w:tr>
-      <w:tr>
-        <w:trPr>
-          <w:cantSplit/>
-        </w:trPr>
-        <w:tc>
-          <w:tcPr>
             <w:tcW w:type="dxa" w:w="454"/>
             <w:vAlign w:val="center"/>
           </w:tcPr>
@@ -4832,117 +4716,6 @@
                 <w:sz w:val="16"/>
               </w:rPr>
               <w:t>37</w:t>
-            </w:r>
-          </w:p>
-        </w:tc>
-        <w:tc>
-          <w:tcPr>
-            <w:tcW w:type="dxa" w:w="907"/>
-            <w:vAlign w:val="center"/>
-          </w:tcPr>
-          <w:p>
-            <w:pPr>
-              <w:spacing w:before="20" w:after="20" w:line="240" w:lineRule="auto"/>
-              <w:jc w:val="center"/>
-            </w:pPr>
-            <w:r>
-              <w:rPr>
-                <w:rFonts w:ascii="Arial" w:hAnsi="Arial" w:eastAsia="Arial"/>
-                <w:b/>
-                <w:i w:val="0"/>
-                <w:color w:val="7B1E2B"/>
-                <w:sz w:val="16"/>
-              </w:rPr>
-              <w:t>DPLV-35</w:t>
-            </w:r>
-          </w:p>
-        </w:tc>
-        <w:tc>
-          <w:tcPr>
-            <w:tcW w:type="dxa" w:w="6407"/>
-            <w:vAlign w:val="center"/>
-          </w:tcPr>
-          <w:p>
-            <w:pPr>
-              <w:spacing w:before="20" w:after="20" w:line="240" w:lineRule="auto"/>
-              <w:jc w:val="left"/>
-            </w:pPr>
-            <w:r>
-              <w:rPr>
-                <w:rFonts w:ascii="Arial" w:hAnsi="Arial" w:eastAsia="Arial"/>
-                <w:b/>
-                <w:i w:val="0"/>
-                <w:sz w:val="16"/>
-              </w:rPr>
-              <w:t>DETALLE DE LLORADERO: CORTE, TUBO PERFORADO Y DESAGREGADO</w:t>
-            </w:r>
-          </w:p>
-        </w:tc>
-        <w:tc>
-          <w:tcPr>
-            <w:tcW w:type="dxa" w:w="1020"/>
-            <w:vAlign w:val="center"/>
-          </w:tcPr>
-          <w:p>
-            <w:pPr>
-              <w:spacing w:before="20" w:after="20" w:line="240" w:lineRule="auto"/>
-              <w:jc w:val="center"/>
-            </w:pPr>
-            <w:r>
-              <w:rPr>
-                <w:rFonts w:ascii="Arial" w:hAnsi="Arial" w:eastAsia="Arial"/>
-                <w:b w:val="0"/>
-                <w:i w:val="0"/>
-                <w:sz w:val="16"/>
-              </w:rPr>
-              <w:t>A3</w:t>
-            </w:r>
-          </w:p>
-        </w:tc>
-        <w:tc>
-          <w:tcPr>
-            <w:tcW w:type="dxa" w:w="1077"/>
-            <w:vAlign w:val="center"/>
-          </w:tcPr>
-          <w:p>
-            <w:pPr>
-              <w:spacing w:before="20" w:after="20" w:line="240" w:lineRule="auto"/>
-              <w:jc w:val="center"/>
-            </w:pPr>
-            <w:r>
-              <w:rPr>
-                <w:rFonts w:ascii="Arial" w:hAnsi="Arial" w:eastAsia="Arial"/>
-                <w:b w:val="0"/>
-                <w:i w:val="0"/>
-                <w:sz w:val="16"/>
-              </w:rPr>
-              <w:t>INDICADA</w:t>
-            </w:r>
-          </w:p>
-        </w:tc>
-      </w:tr>
-      <w:tr>
-        <w:trPr>
-          <w:cantSplit/>
-        </w:trPr>
-        <w:tc>
-          <w:tcPr>
-            <w:tcW w:type="dxa" w:w="454"/>
-            <w:vAlign w:val="center"/>
-          </w:tcPr>
-          <w:p>
-            <w:pPr>
-              <w:spacing w:before="20" w:after="20" w:line="240" w:lineRule="auto"/>
-              <w:jc w:val="center"/>
-            </w:pPr>
-            <w:r>
-              <w:rPr>
-                <w:rFonts w:ascii="Arial" w:hAnsi="Arial" w:eastAsia="Arial"/>
-                <w:b w:val="0"/>
-                <w:i w:val="0"/>
-                <w:sz w:val="16"/>
-              </w:rPr>
-              <w:t>38</w:t>
             </w:r>
           </w:p>
         </w:tc>
@@ -5053,7 +4826,7 @@
                 <w:i w:val="0"/>
                 <w:sz w:val="16"/>
               </w:rPr>
-              <w:t>39</w:t>
+              <w:t>38</w:t>
             </w:r>
           </w:p>
         </w:tc>
@@ -5164,7 +4937,7 @@
                 <w:i w:val="0"/>
                 <w:sz w:val="16"/>
               </w:rPr>
-              <w:t>40</w:t>
+              <w:t>39</w:t>
             </w:r>
           </w:p>
         </w:tc>
@@ -5275,7 +5048,7 @@
                 <w:i w:val="0"/>
                 <w:sz w:val="16"/>
               </w:rPr>
-              <w:t>41</w:t>
+              <w:t>40</w:t>
             </w:r>
           </w:p>
         </w:tc>
@@ -5386,7 +5159,7 @@
                 <w:i w:val="0"/>
                 <w:sz w:val="16"/>
               </w:rPr>
-              <w:t>42</w:t>
+              <w:t>41</w:t>
             </w:r>
           </w:p>
         </w:tc>
@@ -5497,7 +5270,7 @@
                 <w:i w:val="0"/>
                 <w:sz w:val="16"/>
               </w:rPr>
-              <w:t>43</w:t>
+              <w:t>42</w:t>
             </w:r>
           </w:p>
         </w:tc>
@@ -5562,6 +5335,117 @@
                 <w:sz w:val="16"/>
               </w:rPr>
               <w:t>A3</w:t>
+            </w:r>
+          </w:p>
+        </w:tc>
+        <w:tc>
+          <w:tcPr>
+            <w:tcW w:type="dxa" w:w="1077"/>
+            <w:vAlign w:val="center"/>
+          </w:tcPr>
+          <w:p>
+            <w:pPr>
+              <w:spacing w:before="20" w:after="20" w:line="240" w:lineRule="auto"/>
+              <w:jc w:val="center"/>
+            </w:pPr>
+            <w:r>
+              <w:rPr>
+                <w:rFonts w:ascii="Arial" w:hAnsi="Arial" w:eastAsia="Arial"/>
+                <w:b w:val="0"/>
+                <w:i w:val="0"/>
+                <w:sz w:val="16"/>
+              </w:rPr>
+              <w:t>INDICADA</w:t>
+            </w:r>
+          </w:p>
+        </w:tc>
+      </w:tr>
+      <w:tr>
+        <w:trPr>
+          <w:cantSplit/>
+        </w:trPr>
+        <w:tc>
+          <w:tcPr>
+            <w:tcW w:type="dxa" w:w="454"/>
+            <w:vAlign w:val="center"/>
+          </w:tcPr>
+          <w:p>
+            <w:pPr>
+              <w:spacing w:before="20" w:after="20" w:line="240" w:lineRule="auto"/>
+              <w:jc w:val="center"/>
+            </w:pPr>
+            <w:r>
+              <w:rPr>
+                <w:rFonts w:ascii="Arial" w:hAnsi="Arial" w:eastAsia="Arial"/>
+                <w:b w:val="0"/>
+                <w:i w:val="0"/>
+                <w:sz w:val="16"/>
+              </w:rPr>
+              <w:t>43</w:t>
+            </w:r>
+          </w:p>
+        </w:tc>
+        <w:tc>
+          <w:tcPr>
+            <w:tcW w:type="dxa" w:w="907"/>
+            <w:vAlign w:val="center"/>
+          </w:tcPr>
+          <w:p>
+            <w:pPr>
+              <w:spacing w:before="20" w:after="20" w:line="240" w:lineRule="auto"/>
+              <w:jc w:val="center"/>
+            </w:pPr>
+            <w:r>
+              <w:rPr>
+                <w:rFonts w:ascii="Arial" w:hAnsi="Arial" w:eastAsia="Arial"/>
+                <w:b/>
+                <w:i w:val="0"/>
+                <w:color w:val="7B1E2B"/>
+                <w:sz w:val="16"/>
+              </w:rPr>
+              <w:t>DPLV-43</w:t>
+            </w:r>
+          </w:p>
+        </w:tc>
+        <w:tc>
+          <w:tcPr>
+            <w:tcW w:type="dxa" w:w="6407"/>
+            <w:vAlign w:val="center"/>
+          </w:tcPr>
+          <w:p>
+            <w:pPr>
+              <w:spacing w:before="20" w:after="20" w:line="240" w:lineRule="auto"/>
+              <w:jc w:val="left"/>
+            </w:pPr>
+            <w:r>
+              <w:rPr>
+                <w:rFonts w:ascii="Arial" w:hAnsi="Arial" w:eastAsia="Arial"/>
+                <w:b/>
+                <w:i w:val="0"/>
+                <w:sz w:val="16"/>
+              </w:rPr>
+              <w:t>PLANTA DE UBICACIÓN DE LLORADEROS EN CUNETAS COLINDANTES CON ÁREA VERDE</w:t>
+            </w:r>
+          </w:p>
+        </w:tc>
+        <w:tc>
+          <w:tcPr>
+            <w:tcW w:type="dxa" w:w="1020"/>
+            <w:vAlign w:val="center"/>
+          </w:tcPr>
+          <w:p>
+            <w:pPr>
+              <w:spacing w:before="20" w:after="20" w:line="240" w:lineRule="auto"/>
+              <w:jc w:val="center"/>
+            </w:pPr>
+            <w:r>
+              <w:rPr>
+                <w:rFonts w:ascii="Arial" w:hAnsi="Arial" w:eastAsia="Arial"/>
+                <w:b w:val="0"/>
+                <w:i w:val="0"/>
+                <w:sz w:val="16"/>
+              </w:rPr>
+              <w:t>A0</w:t>
             </w:r>
           </w:p>
         </w:tc>
@@ -5743,7 +5627,7 @@
           <w:color w:val="595959"/>
           <w:sz w:val="16"/>
         </w:rPr>
-        <w:t>El N.° es el orden de la lámina en el juego de planos, organizado por formato de hoja (A0, A1, A2 y A3).</w:t>
+        <w:t>Láminas ordenadas por su número, de la primera a la última.</w:t>
       </w:r>
     </w:p>
     <w:sectPr>

</xml_diff>